<commit_message>
docs: susun ulang daftar pustaka sesuai urutan Mendeley (19 entri) dan perbaiki nomor sitasi
</commit_message>
<xml_diff>
--- a/docs/Proposal-Agen Cerdas FINRA.docx
+++ b/docs/Proposal-Agen Cerdas FINRA.docx
@@ -5111,7 +5111,83 @@
           <w:sz w:val="24"/>
           <w:szCs w:val="24"/>
         </w:rPr>
-        <w:t>Perkembangan kecerdasan buatan dalam beberapa tahun terakhir telah menggeser paradigma dari rule-based chatbot konvensional menuju agen otonom berbasis Large Language Models (LLM) yang mampu melakukan penalaran (reasoning), perencanaan (planning), penyimpanan konteks memori, serta penggunaan alat eksternal (tool use) 1, 2. Dalam domain manajemen keuangan pribadi (Personal Financial Management / PFM), adopsi pemrosesan bahasa alami (Natural Language Processing / NLP) dan agen cerdas terbukti mampu mengatasi kebiasaan menunda atau mengabaikan pencatatan anggaran akibat antarmuka aplikasi konvensional yang kaku 3, 4.</w:t>
+        <w:t xml:space="preserve">Perkembangan kecerdasan buatan dalam beberapa tahun terakhir telah menggeser paradigma dari rule-based chatbot konvensional menuju agen otonom berbasis Large Language Models (LLM) yang mampu melakukan penalaran (reasoning), perencanaan (planning), penyimpanan konteks memori, serta penggunaan alat eksternal (tool use) </w:t>
+      </w:r>
+      <w:r>
+        <w:rPr>
+          <w:rFonts w:ascii="Times New Roman" w:hAnsi="Times New Roman" w:cs="Times New Roman"/>
+          <w:b/>
+          <w:color w:val="C00000"/>
+          <w:sz w:val="24"/>
+          <w:szCs w:val="24"/>
+          <w:highlight w:val="yellow"/>
+        </w:rPr>
+        <w:t xml:space="preserve">[4]</w:t>
+      </w:r>
+      <w:r>
+        <w:rPr>
+          <w:rFonts w:ascii="Times New Roman" w:hAnsi="Times New Roman" w:cs="Times New Roman"/>
+          <w:sz w:val="24"/>
+          <w:szCs w:val="24"/>
+        </w:rPr>
+        <w:t xml:space="preserve">, </w:t>
+      </w:r>
+      <w:r>
+        <w:rPr>
+          <w:rFonts w:ascii="Times New Roman" w:hAnsi="Times New Roman" w:cs="Times New Roman"/>
+          <w:b/>
+          <w:color w:val="C00000"/>
+          <w:sz w:val="24"/>
+          <w:szCs w:val="24"/>
+          <w:highlight w:val="yellow"/>
+        </w:rPr>
+        <w:t xml:space="preserve">[12]</w:t>
+      </w:r>
+      <w:r>
+        <w:rPr>
+          <w:rFonts w:ascii="Times New Roman" w:hAnsi="Times New Roman" w:cs="Times New Roman"/>
+          <w:sz w:val="24"/>
+          <w:szCs w:val="24"/>
+        </w:rPr>
+        <w:t xml:space="preserve">. Dalam domain manajemen keuangan pribadi (Personal Financial Management / PFM), adopsi pemrosesan bahasa alami (Natural Language Processing / NLP) dan agen cerdas terbukti mampu mengatasi kebiasaan menunda atau mengabaikan pencatatan anggaran akibat antarmuka aplikasi konvensional yang kaku </w:t>
+      </w:r>
+      <w:r>
+        <w:rPr>
+          <w:rFonts w:ascii="Times New Roman" w:hAnsi="Times New Roman" w:cs="Times New Roman"/>
+          <w:b/>
+          <w:color w:val="C00000"/>
+          <w:sz w:val="24"/>
+          <w:szCs w:val="24"/>
+          <w:highlight w:val="yellow"/>
+        </w:rPr>
+        <w:t xml:space="preserve">[3]</w:t>
+      </w:r>
+      <w:r>
+        <w:rPr>
+          <w:rFonts w:ascii="Times New Roman" w:hAnsi="Times New Roman" w:cs="Times New Roman"/>
+          <w:sz w:val="24"/>
+          <w:szCs w:val="24"/>
+        </w:rPr>
+        <w:t xml:space="preserve">, </w:t>
+      </w:r>
+      <w:r>
+        <w:rPr>
+          <w:rFonts w:ascii="Times New Roman" w:hAnsi="Times New Roman" w:cs="Times New Roman"/>
+          <w:b/>
+          <w:color w:val="C00000"/>
+          <w:sz w:val="24"/>
+          <w:szCs w:val="24"/>
+          <w:highlight w:val="yellow"/>
+        </w:rPr>
+        <w:t xml:space="preserve">[6]</w:t>
+      </w:r>
+      <w:r>
+        <w:rPr>
+          <w:rFonts w:ascii="Times New Roman" w:hAnsi="Times New Roman" w:cs="Times New Roman"/>
+          <w:sz w:val="24"/>
+          <w:szCs w:val="24"/>
+        </w:rPr>
+        <w:t xml:space="preserve">.</w:t>
       </w:r>
     </w:p>
     <w:p>
@@ -5163,7 +5239,8 @@
     </w:p>
     <w:p>
       <w:pPr>
-        <w:spacing w:after="0" w:afterAutospacing="0"/>
+        <w:keepNext/>
+        <w:spacing w:after="80" w:afterAutospacing="0"/>
         <w:jc w:val="center"/>
         <w:rPr>
           <w:rFonts w:ascii="Times New Roman" w:hAnsi="Times New Roman" w:cs="Times New Roman"/>
@@ -5206,6 +5283,7 @@
       <w:tr>
         <w:trPr>
           <w:cantSplit/>
+          <w:tblHeader/>
         </w:trPr>
         <w:tc>
           <w:tcPr>
@@ -5215,6 +5293,7 @@
           </w:tcPr>
           <w:p>
             <w:pPr>
+              <w:keepNext/>
               <w:spacing w:line="240" w:lineRule="auto" w:before="10" w:after="20"/>
               <w:jc w:val="center"/>
               <w:rPr>
@@ -5243,6 +5322,7 @@
           </w:tcPr>
           <w:p>
             <w:pPr>
+              <w:keepNext/>
               <w:spacing w:line="240" w:lineRule="auto" w:before="10" w:after="20"/>
               <w:jc w:val="center"/>
               <w:rPr>
@@ -5271,6 +5351,7 @@
           </w:tcPr>
           <w:p>
             <w:pPr>
+              <w:keepNext/>
               <w:spacing w:line="240" w:lineRule="auto" w:before="10" w:after="20"/>
               <w:jc w:val="center"/>
               <w:rPr>
@@ -5299,6 +5380,7 @@
           </w:tcPr>
           <w:p>
             <w:pPr>
+              <w:keepNext/>
               <w:spacing w:line="240" w:lineRule="auto" w:before="10" w:after="20"/>
               <w:jc w:val="center"/>
               <w:rPr>
@@ -5327,6 +5409,7 @@
           </w:tcPr>
           <w:p>
             <w:pPr>
+              <w:keepNext/>
               <w:spacing w:line="240" w:lineRule="auto" w:before="10" w:after="20"/>
               <w:rPr>
                 <w:rFonts w:ascii="Times New Roman" w:hAnsi="Times New Roman" w:cs="Times New Roman"/>
@@ -5354,6 +5437,7 @@
           </w:tcPr>
           <w:p>
             <w:pPr>
+              <w:keepNext/>
               <w:spacing w:line="240" w:lineRule="auto" w:before="10" w:after="20"/>
               <w:jc w:val="center"/>
               <w:rPr>
@@ -5382,6 +5466,7 @@
           </w:tcPr>
           <w:p>
             <w:pPr>
+              <w:keepNext/>
               <w:spacing w:line="240" w:lineRule="auto" w:before="10" w:after="20"/>
               <w:jc w:val="center"/>
               <w:rPr>
@@ -5455,7 +5540,18 @@
                 <w:sz w:val="18"/>
                 <w:szCs w:val="18"/>
               </w:rPr>
-              <w:t>Patel et al. (2024) [3]</w:t>
+              <w:t xml:space="preserve">Patel et al. (2024) </w:t>
+            </w:r>
+            <w:r>
+              <w:rPr>
+                <w:rFonts w:ascii="Times New Roman" w:hAnsi="Times New Roman" w:cs="Times New Roman"/>
+                <w:b/>
+                <w:color w:val="C00000"/>
+                <w:sz w:val="18"/>
+                <w:szCs w:val="18"/>
+                <w:highlight w:val="yellow"/>
+              </w:rPr>
+              <w:t xml:space="preserve">[3]</w:t>
             </w:r>
           </w:p>
         </w:tc>
@@ -5640,7 +5736,18 @@
                 <w:sz w:val="18"/>
                 <w:szCs w:val="18"/>
               </w:rPr>
-              <w:t>Takayanagi et al. (2025) [4]</w:t>
+              <w:t xml:space="preserve">Takayanagi et al. (2025) </w:t>
+            </w:r>
+            <w:r>
+              <w:rPr>
+                <w:rFonts w:ascii="Times New Roman" w:hAnsi="Times New Roman" w:cs="Times New Roman"/>
+                <w:b/>
+                <w:color w:val="C00000"/>
+                <w:sz w:val="18"/>
+                <w:szCs w:val="18"/>
+                <w:highlight w:val="yellow"/>
+              </w:rPr>
+              <w:t xml:space="preserve">[7]</w:t>
             </w:r>
           </w:p>
         </w:tc>
@@ -5822,7 +5929,18 @@
                 <w:sz w:val="18"/>
                 <w:szCs w:val="18"/>
               </w:rPr>
-              <w:t>Yang et al. (2023) [5]</w:t>
+              <w:t xml:space="preserve">Yang et al. (2023) </w:t>
+            </w:r>
+            <w:r>
+              <w:rPr>
+                <w:rFonts w:ascii="Times New Roman" w:hAnsi="Times New Roman" w:cs="Times New Roman"/>
+                <w:b/>
+                <w:color w:val="C00000"/>
+                <w:sz w:val="18"/>
+                <w:szCs w:val="18"/>
+                <w:highlight w:val="yellow"/>
+              </w:rPr>
+              <w:t xml:space="preserve">[8]</w:t>
             </w:r>
           </w:p>
         </w:tc>
@@ -6007,7 +6125,18 @@
                 <w:sz w:val="18"/>
                 <w:szCs w:val="18"/>
               </w:rPr>
-              <w:t>Lee et al. (2022) [6]</w:t>
+              <w:t xml:space="preserve">Lee et al. (2022) </w:t>
+            </w:r>
+            <w:r>
+              <w:rPr>
+                <w:rFonts w:ascii="Times New Roman" w:hAnsi="Times New Roman" w:cs="Times New Roman"/>
+                <w:b/>
+                <w:color w:val="C00000"/>
+                <w:sz w:val="18"/>
+                <w:szCs w:val="18"/>
+                <w:highlight w:val="yellow"/>
+              </w:rPr>
+              <w:t xml:space="preserve">[5]</w:t>
             </w:r>
           </w:p>
         </w:tc>
@@ -6189,7 +6318,18 @@
                 <w:sz w:val="18"/>
                 <w:szCs w:val="18"/>
               </w:rPr>
-              <w:t>Agarwal et al. (2024) [7]</w:t>
+              <w:t xml:space="preserve">Agarwal et al. (2024) </w:t>
+            </w:r>
+            <w:r>
+              <w:rPr>
+                <w:rFonts w:ascii="Times New Roman" w:hAnsi="Times New Roman" w:cs="Times New Roman"/>
+                <w:b/>
+                <w:color w:val="C00000"/>
+                <w:sz w:val="18"/>
+                <w:szCs w:val="18"/>
+                <w:highlight w:val="yellow"/>
+              </w:rPr>
+              <w:t xml:space="preserve">[6]</w:t>
             </w:r>
           </w:p>
         </w:tc>
@@ -6361,7 +6501,6 @@
         <w:tc>
           <w:tcPr>
             <w:tcW w:w="757" w:type="dxa"/>
-            <w:shd w:val="clear" w:color="auto" w:fill="17365D" w:themeFill="text2" w:themeFillShade="BF"/>
             <w:vAlign w:val="center"/>
           </w:tcPr>
           <w:p>
@@ -6374,238 +6513,49 @@
                 <w:szCs w:val="18"/>
               </w:rPr>
             </w:pPr>
+            <w:r>
+              <w:rPr>
+                <w:rFonts w:ascii="Times New Roman" w:hAnsi="Times New Roman" w:cs="Times New Roman"/>
+                <w:sz w:val="18"/>
+                <w:szCs w:val="18"/>
+              </w:rPr>
+              <w:t>6</w:t>
+            </w:r>
+          </w:p>
+        </w:tc>
+        <w:tc>
+          <w:tcPr>
+            <w:tcW w:w="1131" w:type="dxa"/>
+            <w:vAlign w:val="center"/>
+          </w:tcPr>
+          <w:p>
+            <w:pPr>
+              <w:spacing w:line="240" w:lineRule="auto" w:before="10" w:after="20"/>
+              <w:jc w:val="center"/>
+              <w:rPr>
+                <w:rFonts w:ascii="Times New Roman" w:hAnsi="Times New Roman" w:cs="Times New Roman"/>
+                <w:sz w:val="18"/>
+                <w:szCs w:val="18"/>
+              </w:rPr>
+            </w:pPr>
+            <w:r>
+              <w:rPr>
+                <w:rFonts w:ascii="Times New Roman" w:hAnsi="Times New Roman" w:cs="Times New Roman"/>
+                <w:sz w:val="18"/>
+                <w:szCs w:val="18"/>
+              </w:rPr>
+              <w:t xml:space="preserve">Singh et al. (2025) </w:t>
+            </w:r>
             <w:r>
               <w:rPr>
                 <w:rFonts w:ascii="Times New Roman" w:hAnsi="Times New Roman" w:cs="Times New Roman"/>
                 <w:b/>
-                <w:bCs/>
+                <w:color w:val="C00000"/>
                 <w:sz w:val="18"/>
                 <w:szCs w:val="18"/>
-              </w:rPr>
-              <w:t>No</w:t>
-            </w:r>
-          </w:p>
-        </w:tc>
-        <w:tc>
-          <w:tcPr>
-            <w:tcW w:w="1131" w:type="dxa"/>
-            <w:shd w:val="clear" w:color="auto" w:fill="17365D" w:themeFill="text2" w:themeFillShade="BF"/>
-            <w:vAlign w:val="center"/>
-          </w:tcPr>
-          <w:p>
-            <w:pPr>
-              <w:spacing w:line="240" w:lineRule="auto" w:before="10" w:after="20"/>
-              <w:jc w:val="center"/>
-              <w:rPr>
-                <w:rFonts w:ascii="Times New Roman" w:hAnsi="Times New Roman" w:cs="Times New Roman"/>
-                <w:sz w:val="18"/>
-                <w:szCs w:val="18"/>
-              </w:rPr>
-            </w:pPr>
-            <w:r>
-              <w:rPr>
-                <w:rFonts w:ascii="Times New Roman" w:hAnsi="Times New Roman" w:cs="Times New Roman"/>
-                <w:b/>
-                <w:bCs/>
-                <w:sz w:val="18"/>
-                <w:szCs w:val="18"/>
-              </w:rPr>
-              <w:t>Penulis &amp; Tahun</w:t>
-            </w:r>
-          </w:p>
-        </w:tc>
-        <w:tc>
-          <w:tcPr>
-            <w:tcW w:w="1496" w:type="dxa"/>
-            <w:shd w:val="clear" w:color="auto" w:fill="17365D" w:themeFill="text2" w:themeFillShade="BF"/>
-            <w:vAlign w:val="center"/>
-          </w:tcPr>
-          <w:p>
-            <w:pPr>
-              <w:spacing w:line="240" w:lineRule="auto" w:before="10" w:after="20"/>
-              <w:jc w:val="center"/>
-              <w:rPr>
-                <w:rFonts w:ascii="Times New Roman" w:hAnsi="Times New Roman" w:cs="Times New Roman"/>
-                <w:sz w:val="18"/>
-                <w:szCs w:val="18"/>
-              </w:rPr>
-            </w:pPr>
-            <w:r>
-              <w:rPr>
-                <w:rFonts w:ascii="Times New Roman" w:hAnsi="Times New Roman" w:cs="Times New Roman"/>
-                <w:b/>
-                <w:bCs/>
-                <w:sz w:val="18"/>
-                <w:szCs w:val="18"/>
-              </w:rPr>
-              <w:t>Kasus / Fokus Masalah</w:t>
-            </w:r>
-          </w:p>
-        </w:tc>
-        <w:tc>
-          <w:tcPr>
-            <w:tcW w:w="1187" w:type="dxa"/>
-            <w:shd w:val="clear" w:color="auto" w:fill="17365D" w:themeFill="text2" w:themeFillShade="BF"/>
-            <w:vAlign w:val="center"/>
-          </w:tcPr>
-          <w:p>
-            <w:pPr>
-              <w:spacing w:line="240" w:lineRule="auto" w:before="10" w:after="20"/>
-              <w:jc w:val="center"/>
-              <w:rPr>
-                <w:rFonts w:ascii="Times New Roman" w:hAnsi="Times New Roman" w:cs="Times New Roman"/>
-                <w:sz w:val="18"/>
-                <w:szCs w:val="18"/>
-              </w:rPr>
-            </w:pPr>
-            <w:r>
-              <w:rPr>
-                <w:rFonts w:ascii="Times New Roman" w:hAnsi="Times New Roman" w:cs="Times New Roman"/>
-                <w:b/>
-                <w:bCs/>
-                <w:sz w:val="18"/>
-                <w:szCs w:val="18"/>
-              </w:rPr>
-              <w:t>Metode / Pendekatan AI</w:t>
-            </w:r>
-          </w:p>
-        </w:tc>
-        <w:tc>
-          <w:tcPr>
-            <w:tcW w:w="1441" w:type="dxa"/>
-            <w:shd w:val="clear" w:color="auto" w:fill="17365D" w:themeFill="text2" w:themeFillShade="BF"/>
-            <w:vAlign w:val="center"/>
-          </w:tcPr>
-          <w:p>
-            <w:pPr>
-              <w:spacing w:line="240" w:lineRule="auto" w:before="10" w:after="20"/>
-              <w:jc w:val="center"/>
-              <w:rPr>
-                <w:rFonts w:ascii="Times New Roman" w:hAnsi="Times New Roman" w:cs="Times New Roman"/>
-                <w:sz w:val="18"/>
-                <w:szCs w:val="18"/>
-              </w:rPr>
-            </w:pPr>
-            <w:r>
-              <w:rPr>
-                <w:rFonts w:ascii="Times New Roman" w:hAnsi="Times New Roman" w:cs="Times New Roman"/>
-                <w:b/>
-                <w:bCs/>
-                <w:sz w:val="18"/>
-                <w:szCs w:val="18"/>
-              </w:rPr>
-              <w:t>Data / Dataset yang Digunakan</w:t>
-            </w:r>
-          </w:p>
-        </w:tc>
-        <w:tc>
-          <w:tcPr>
-            <w:tcW w:w="1379" w:type="dxa"/>
-            <w:shd w:val="clear" w:color="auto" w:fill="17365D" w:themeFill="text2" w:themeFillShade="BF"/>
-            <w:vAlign w:val="center"/>
-          </w:tcPr>
-          <w:p>
-            <w:pPr>
-              <w:spacing w:line="240" w:lineRule="auto" w:before="10" w:after="20"/>
-              <w:jc w:val="center"/>
-              <w:rPr>
-                <w:rFonts w:ascii="Times New Roman" w:hAnsi="Times New Roman" w:cs="Times New Roman"/>
-                <w:sz w:val="18"/>
-                <w:szCs w:val="18"/>
-              </w:rPr>
-            </w:pPr>
-            <w:r>
-              <w:rPr>
-                <w:rFonts w:ascii="Times New Roman" w:hAnsi="Times New Roman" w:cs="Times New Roman"/>
-                <w:b/>
-                <w:bCs/>
-                <w:sz w:val="18"/>
-                <w:szCs w:val="18"/>
-              </w:rPr>
-              <w:t>Hasil / Temuan Utama</w:t>
-            </w:r>
-          </w:p>
-        </w:tc>
-        <w:tc>
-          <w:tcPr>
-            <w:tcW w:w="1323" w:type="dxa"/>
-            <w:shd w:val="clear" w:color="auto" w:fill="17365D" w:themeFill="text2" w:themeFillShade="BF"/>
-            <w:vAlign w:val="center"/>
-          </w:tcPr>
-          <w:p>
-            <w:pPr>
-              <w:spacing w:line="240" w:lineRule="auto" w:before="10" w:after="20"/>
-              <w:jc w:val="center"/>
-              <w:rPr>
-                <w:rFonts w:ascii="Times New Roman" w:hAnsi="Times New Roman" w:cs="Times New Roman"/>
-                <w:sz w:val="18"/>
-                <w:szCs w:val="18"/>
-              </w:rPr>
-            </w:pPr>
-            <w:r>
-              <w:rPr>
-                <w:rFonts w:ascii="Times New Roman" w:hAnsi="Times New Roman" w:cs="Times New Roman"/>
-                <w:b/>
-                <w:bCs/>
-                <w:sz w:val="18"/>
-                <w:szCs w:val="18"/>
-              </w:rPr>
-              <w:t>Kelemahan / Keterbatasan</w:t>
-            </w:r>
-          </w:p>
-        </w:tc>
-      </w:tr>
-      <w:tr>
-        <w:trPr>
-          <w:cantSplit/>
-        </w:trPr>
-        <w:tc>
-          <w:tcPr>
-            <w:tcW w:w="757" w:type="dxa"/>
-            <w:vAlign w:val="center"/>
-          </w:tcPr>
-          <w:p>
-            <w:pPr>
-              <w:spacing w:line="240" w:lineRule="auto" w:before="10" w:after="20"/>
-              <w:jc w:val="center"/>
-              <w:rPr>
-                <w:rFonts w:ascii="Times New Roman" w:hAnsi="Times New Roman" w:cs="Times New Roman"/>
-                <w:sz w:val="18"/>
-                <w:szCs w:val="18"/>
-              </w:rPr>
-            </w:pPr>
-            <w:r>
-              <w:rPr>
-                <w:rFonts w:ascii="Times New Roman" w:hAnsi="Times New Roman" w:cs="Times New Roman"/>
-                <w:sz w:val="18"/>
-                <w:szCs w:val="18"/>
-              </w:rPr>
-              <w:t>6</w:t>
-            </w:r>
-          </w:p>
-        </w:tc>
-        <w:tc>
-          <w:tcPr>
-            <w:tcW w:w="1131" w:type="dxa"/>
-            <w:vAlign w:val="center"/>
-          </w:tcPr>
-          <w:p>
-            <w:pPr>
-              <w:spacing w:line="240" w:lineRule="auto" w:before="10" w:after="20"/>
-              <w:jc w:val="center"/>
-              <w:rPr>
-                <w:rFonts w:ascii="Times New Roman" w:hAnsi="Times New Roman" w:cs="Times New Roman"/>
-                <w:sz w:val="18"/>
-                <w:szCs w:val="18"/>
-              </w:rPr>
-            </w:pPr>
-            <w:r>
-              <w:rPr>
-                <w:rFonts w:ascii="Times New Roman" w:hAnsi="Times New Roman" w:cs="Times New Roman"/>
-                <w:sz w:val="18"/>
-                <w:szCs w:val="18"/>
-              </w:rPr>
-              <w:t>Singh et al. (2025) [8]</w:t>
+                <w:highlight w:val="yellow"/>
+              </w:rPr>
+              <w:t xml:space="preserve">[13]</w:t>
             </w:r>
           </w:p>
         </w:tc>
@@ -6810,7 +6760,49 @@
           <w:szCs w:val="24"/>
           <w:lang w:val="en-ID"/>
         </w:rPr>
-        <w:t>Ekstraksi bahasa terpisah dari logika anggaran: Penelitian terdahulu umumnya memisahkan pemrosesan bahasa alami (NLP) dari sistem manajemen anggaran. DistilBERT [3] dan LayoutLM [6] mengenali entitas dengan baik, tetapi berhenti di tahap ekstraksi dan tidak mengecek pagu anggaran secara real-time.</w:t>
+        <w:t xml:space="preserve">Ekstraksi bahasa terpisah dari logika anggaran: Penelitian terdahulu umumnya memisahkan pemrosesan bahasa alami (NLP) dari sistem manajemen anggaran. DistilBERT </w:t>
+      </w:r>
+      <w:r>
+        <w:rPr>
+          <w:rFonts w:ascii="Times New Roman" w:hAnsi="Times New Roman" w:cs="Times New Roman"/>
+          <w:b/>
+          <w:color w:val="C00000"/>
+          <w:sz w:val="24"/>
+          <w:szCs w:val="24"/>
+          <w:highlight w:val="yellow"/>
+          <w:lang w:val="en-ID"/>
+        </w:rPr>
+        <w:t xml:space="preserve">[3]</w:t>
+      </w:r>
+      <w:r>
+        <w:rPr>
+          <w:rFonts w:ascii="Times New Roman" w:hAnsi="Times New Roman" w:cs="Times New Roman"/>
+          <w:sz w:val="24"/>
+          <w:szCs w:val="24"/>
+          <w:lang w:val="en-ID"/>
+        </w:rPr>
+        <w:t xml:space="preserve"> dan LayoutLM </w:t>
+      </w:r>
+      <w:r>
+        <w:rPr>
+          <w:rFonts w:ascii="Times New Roman" w:hAnsi="Times New Roman" w:cs="Times New Roman"/>
+          <w:b/>
+          <w:color w:val="C00000"/>
+          <w:sz w:val="24"/>
+          <w:szCs w:val="24"/>
+          <w:highlight w:val="yellow"/>
+          <w:lang w:val="en-ID"/>
+        </w:rPr>
+        <w:t xml:space="preserve">[5]</w:t>
+      </w:r>
+      <w:r>
+        <w:rPr>
+          <w:rFonts w:ascii="Times New Roman" w:hAnsi="Times New Roman" w:cs="Times New Roman"/>
+          <w:sz w:val="24"/>
+          <w:szCs w:val="24"/>
+          <w:lang w:val="en-ID"/>
+        </w:rPr>
+        <w:t xml:space="preserve"> mengenali entitas dengan baik, tetapi berhenti di tahap ekstraksi dan tidak mengecek pagu anggaran secara real-time.</w:t>
       </w:r>
     </w:p>
     <w:p>
@@ -6833,7 +6825,49 @@
           <w:szCs w:val="24"/>
           <w:lang w:val="en-ID"/>
         </w:rPr>
-        <w:t>LLM murni lemah di aritmatika dan rawan halusinasi: Kalau dipakai sendiri untuk menghitung saldo, LLM sering mengalami halusinasi numerik (arithmetic hallucination). Model bisa salah menghitung sisa kuota anggaran atau memberi saran spekulatif yang berisiko [4], [9].</w:t>
+        <w:t xml:space="preserve">LLM murni lemah di aritmatika dan rawan halusinasi: Kalau dipakai sendiri untuk menghitung saldo, LLM sering mengalami halusinasi numerik (arithmetic hallucination). Model bisa salah menghitung sisa kuota anggaran atau memberi saran spekulatif yang berisiko </w:t>
+      </w:r>
+      <w:r>
+        <w:rPr>
+          <w:rFonts w:ascii="Times New Roman" w:hAnsi="Times New Roman" w:cs="Times New Roman"/>
+          <w:b/>
+          <w:color w:val="C00000"/>
+          <w:sz w:val="24"/>
+          <w:szCs w:val="24"/>
+          <w:highlight w:val="yellow"/>
+          <w:lang w:val="en-ID"/>
+        </w:rPr>
+        <w:t xml:space="preserve">[4]</w:t>
+      </w:r>
+      <w:r>
+        <w:rPr>
+          <w:rFonts w:ascii="Times New Roman" w:hAnsi="Times New Roman" w:cs="Times New Roman"/>
+          <w:sz w:val="24"/>
+          <w:szCs w:val="24"/>
+          <w:lang w:val="en-ID"/>
+        </w:rPr>
+        <w:t xml:space="preserve">, </w:t>
+      </w:r>
+      <w:r>
+        <w:rPr>
+          <w:rFonts w:ascii="Times New Roman" w:hAnsi="Times New Roman" w:cs="Times New Roman"/>
+          <w:b/>
+          <w:color w:val="C00000"/>
+          <w:sz w:val="24"/>
+          <w:szCs w:val="24"/>
+          <w:highlight w:val="yellow"/>
+          <w:lang w:val="en-ID"/>
+        </w:rPr>
+        <w:t xml:space="preserve">[9]</w:t>
+      </w:r>
+      <w:r>
+        <w:rPr>
+          <w:rFonts w:ascii="Times New Roman" w:hAnsi="Times New Roman" w:cs="Times New Roman"/>
+          <w:sz w:val="24"/>
+          <w:szCs w:val="24"/>
+          <w:lang w:val="en-ID"/>
+        </w:rPr>
+        <w:t xml:space="preserve">.</w:t>
       </w:r>
     </w:p>
     <w:p>
@@ -6856,18 +6890,41 @@
           <w:szCs w:val="24"/>
           <w:lang w:val="en-ID"/>
         </w:rPr>
-        <w:t>Input lokal kurang fleksibel: Sistem PFM konvensional [7] meminta pengguna mengisi formulir manual, dan itu menimbulkan beban kognitif (cognitive fatigue). Di sisi lain, LLM finansial berskala besar [5] belum disesuaikan secara ringan untuk teks belanja informal berbahasa Indonesia, misalnya singkatan nominal “25rb”, “goceng”, atau “ngopi”.</w:t>
-      </w:r>
-    </w:p>
-    <w:p>
-      <w:pPr>
+        <w:t xml:space="preserve">Input lokal kurang fleksibel: Sistem PFM konvensional </w:t>
+      </w:r>
+      <w:r>
+        <w:rPr>
+          <w:rFonts w:ascii="Times New Roman" w:hAnsi="Times New Roman" w:cs="Times New Roman"/>
+          <w:b/>
+          <w:color w:val="C00000"/>
+          <w:sz w:val="24"/>
+          <w:szCs w:val="24"/>
+          <w:highlight w:val="yellow"/>
+          <w:lang w:val="en-ID"/>
+        </w:rPr>
+        <w:t xml:space="preserve">[7]</w:t>
+      </w:r>
+      <w:r>
         <w:rPr>
           <w:rFonts w:ascii="Times New Roman" w:hAnsi="Times New Roman" w:cs="Times New Roman"/>
           <w:sz w:val="24"/>
           <w:szCs w:val="24"/>
           <w:lang w:val="en-ID"/>
         </w:rPr>
-      </w:pPr>
+        <w:t xml:space="preserve"> meminta pengguna mengisi formulir manual, dan itu menimbulkan beban kognitif (cognitive fatigue). Di sisi lain, LLM finansial berskala besar </w:t>
+      </w:r>
+      <w:r>
+        <w:rPr>
+          <w:rFonts w:ascii="Times New Roman" w:hAnsi="Times New Roman" w:cs="Times New Roman"/>
+          <w:b/>
+          <w:color w:val="C00000"/>
+          <w:sz w:val="24"/>
+          <w:szCs w:val="24"/>
+          <w:highlight w:val="yellow"/>
+          <w:lang w:val="en-ID"/>
+        </w:rPr>
+        <w:t xml:space="preserve">[5]</w:t>
+      </w:r>
       <w:r>
         <w:rPr>
           <w:rFonts w:ascii="Times New Roman" w:hAnsi="Times New Roman" w:cs="Times New Roman"/>
@@ -6875,8 +6932,7 @@
           <w:szCs w:val="24"/>
           <w:lang w:val="en-ID"/>
         </w:rPr>
-        <w:lastRenderedPageBreak/>
-        <w:t>Kebaruan (novelty) agen cerdas FINRA:</w:t>
+        <w:t xml:space="preserve"> belum disesuaikan secara ringan untuk teks belanja informal berbahasa Indonesia, misalnya singkatan nominal “25rb”, “goceng”, atau “ngopi”.</w:t>
       </w:r>
     </w:p>
     <w:p>
@@ -6895,12 +6951,12 @@
           <w:szCs w:val="24"/>
           <w:lang w:val="en-ID"/>
         </w:rPr>
-        <w:t>Untuk menutup celah tersebut, FINRA mengusulkan arsitektur hybrid dengan tiga komponen:</w:t>
+        <w:lastRenderedPageBreak/>
+        <w:t>Kebaruan (novelty) agen cerdas FINRA:</w:t>
       </w:r>
     </w:p>
     <w:p>
       <w:pPr>
-        <w:ind w:left="720"/>
         <w:rPr>
           <w:rFonts w:ascii="Times New Roman" w:hAnsi="Times New Roman" w:cs="Times New Roman"/>
           <w:sz w:val="24"/>
@@ -6915,17 +6971,19 @@
           <w:szCs w:val="24"/>
           <w:lang w:val="en-ID"/>
         </w:rPr>
-        <w:t>Lightweight text-to-transaction parser berbasis LLM: Agen memakai prompt template terkontrol untuk mengubah teks percakapan bebas berbahasa Indonesia informal menjadi data transaksi terstruktur (JSON: tanggal, nominal, pos belanja).</w:t>
-      </w:r>
-      <w:r>
+        <w:t>Untuk menutup celah tersebut, FINRA mengusulkan arsitektur hybrid dengan tiga komponen:</w:t>
+      </w:r>
+    </w:p>
+    <w:p>
+      <w:pPr>
+        <w:ind w:left="720"/>
         <w:rPr>
           <w:rFonts w:ascii="Times New Roman" w:hAnsi="Times New Roman" w:cs="Times New Roman"/>
           <w:sz w:val="24"/>
           <w:szCs w:val="24"/>
           <w:lang w:val="en-ID"/>
         </w:rPr>
-        <w:t xml:space="preserve"> </w:t>
-      </w:r>
+      </w:pPr>
       <w:r>
         <w:rPr>
           <w:rFonts w:ascii="Times New Roman" w:hAnsi="Times New Roman" w:cs="Times New Roman"/>
@@ -6933,7 +6991,7 @@
           <w:szCs w:val="24"/>
           <w:lang w:val="en-ID"/>
         </w:rPr>
-        <w:t>Reasoning dan arithmetic engine yang dipisah: LLM hanya berperan memahami bahasa dan mengatur interaksi. Kalkulasi saldo, batas pagu anggaran (aturan baku 50/30/20), dan peringatan dini (budget alert 80%) diserahkan ke modul komputasi deterministik, sehingga tidak ada kesalahan aritmatika (zero arithmetic error).</w:t>
+        <w:t>Lightweight text-to-transaction parser berbasis LLM: Agen memakai prompt template terkontrol untuk mengubah teks percakapan bebas berbahasa Indonesia informal menjadi data transaksi terstruktur (JSON: tanggal, nominal, pos belanja).</w:t>
       </w:r>
       <w:r>
         <w:rPr>
@@ -6951,7 +7009,46 @@
           <w:szCs w:val="24"/>
           <w:lang w:val="en-ID"/>
         </w:rPr>
-        <w:t>Guardrail tata kelola AI yang bertanggung jawab: Agen mengikuti fungsi tata kelola risiko NIST AI RMF 1.0 [10], tidak memberi anjuran spekulatif berisiko tinggi, dan selalu meminta konfirmasi pengguna sebelum transaksi disimpan permanen.</w:t>
+        <w:t>Reasoning dan arithmetic engine yang dipisah: LLM hanya berperan memahami bahasa dan mengatur interaksi. Kalkulasi saldo, batas pagu anggaran (aturan baku 50/30/20), dan peringatan dini (budget alert 80%) diserahkan ke modul komputasi deterministik, sehingga tidak ada kesalahan aritmatika (zero arithmetic error).</w:t>
+      </w:r>
+      <w:r>
+        <w:rPr>
+          <w:rFonts w:ascii="Times New Roman" w:hAnsi="Times New Roman" w:cs="Times New Roman"/>
+          <w:sz w:val="24"/>
+          <w:szCs w:val="24"/>
+          <w:lang w:val="en-ID"/>
+        </w:rPr>
+        <w:t xml:space="preserve"> </w:t>
+      </w:r>
+      <w:r>
+        <w:rPr>
+          <w:rFonts w:ascii="Times New Roman" w:hAnsi="Times New Roman" w:cs="Times New Roman"/>
+          <w:sz w:val="24"/>
+          <w:szCs w:val="24"/>
+          <w:lang w:val="en-ID"/>
+        </w:rPr>
+        <w:t xml:space="preserve">Guardrail tata kelola AI yang bertanggung jawab: Agen mengikuti fungsi tata kelola risiko NIST AI RMF 1.0 </w:t>
+      </w:r>
+      <w:r>
+        <w:rPr>
+          <w:rFonts w:ascii="Times New Roman" w:hAnsi="Times New Roman" w:cs="Times New Roman"/>
+          <w:b/>
+          <w:color w:val="C00000"/>
+          <w:sz w:val="24"/>
+          <w:szCs w:val="24"/>
+          <w:highlight w:val="yellow"/>
+          <w:lang w:val="en-ID"/>
+        </w:rPr>
+        <w:t xml:space="preserve">[18]</w:t>
+      </w:r>
+      <w:r>
+        <w:rPr>
+          <w:rFonts w:ascii="Times New Roman" w:hAnsi="Times New Roman" w:cs="Times New Roman"/>
+          <w:sz w:val="24"/>
+          <w:szCs w:val="24"/>
+          <w:lang w:val="en-ID"/>
+        </w:rPr>
+        <w:t xml:space="preserve">, tidak memberi anjuran spekulatif berisiko tinggi, dan selalu meminta konfirmasi pengguna sebelum transaksi disimpan permanen.</w:t>
       </w:r>
     </w:p>
     <w:p>
@@ -7019,7 +7116,37 @@
         <w:rPr>
           <w:lang w:val="en-ID"/>
         </w:rPr>
-        <w:t>LLM dan In-Context Learning: LLM adalah jaringan saraf berarsitektur Transformer yang dilatih pada korpus teks berskala besar, sehingga mampu merepresentasikan makna teks secara semantik [1], [2]. FINRA memakai pendekatan In-Context Learning (ICL) dan few-shot prompting. Model diberi beberapa contoh pasangan teks informal dan keluaran JSON terstruktur, tanpa pelatihan ulang bobot parameternya.</w:t>
+        <w:t xml:space="preserve">LLM dan In-Context Learning: LLM adalah jaringan saraf berarsitektur Transformer yang dilatih pada korpus teks berskala besar, sehingga mampu merepresentasikan makna teks secara semantik </w:t>
+      </w:r>
+      <w:r>
+        <w:rPr>
+          <w:b/>
+          <w:color w:val="C00000"/>
+          <w:highlight w:val="yellow"/>
+          <w:lang w:val="en-ID"/>
+        </w:rPr>
+        <w:t xml:space="preserve">[1]</w:t>
+      </w:r>
+      <w:r>
+        <w:rPr>
+          <w:lang w:val="en-ID"/>
+        </w:rPr>
+        <w:t xml:space="preserve">, </w:t>
+      </w:r>
+      <w:r>
+        <w:rPr>
+          <w:b/>
+          <w:color w:val="C00000"/>
+          <w:highlight w:val="yellow"/>
+          <w:lang w:val="en-ID"/>
+        </w:rPr>
+        <w:t xml:space="preserve">[2]</w:t>
+      </w:r>
+      <w:r>
+        <w:rPr>
+          <w:lang w:val="en-ID"/>
+        </w:rPr>
+        <w:t xml:space="preserve">. FINRA memakai pendekatan In-Context Learning (ICL) dan few-shot prompting. Model diberi beberapa contoh pasangan teks informal dan keluaran JSON terstruktur, tanpa pelatihan ulang bobot parameternya.</w:t>
       </w:r>
     </w:p>
     <w:p>
@@ -7036,7 +7163,37 @@
         <w:rPr>
           <w:lang w:val="en-ID"/>
         </w:rPr>
-        <w:t xml:space="preserve">Agentic orchestration dan tool calling: Agen cerdas modern didefinisikan sebagai entitas yang mempersepsi lingkungan lewat sensor, bernalar lewat Agent Orchestrator, dan bertindak lewat aktuator atau tools eksternal [8], [11]. Di FINRA, orkestrator menjalankan alur berurutan: menerima pesan → </w:t>
+        <w:t xml:space="preserve">Agentic orchestration dan tool calling: Agen cerdas modern didefinisikan sebagai entitas yang mempersepsi lingkungan lewat sensor, bernalar lewat Agent Orchestrator, dan bertindak lewat aktuator atau tools eksternal </w:t>
+      </w:r>
+      <w:r>
+        <w:rPr>
+          <w:b/>
+          <w:color w:val="C00000"/>
+          <w:highlight w:val="yellow"/>
+          <w:lang w:val="en-ID"/>
+        </w:rPr>
+        <w:t xml:space="preserve">[8]</w:t>
+      </w:r>
+      <w:r>
+        <w:rPr>
+          <w:lang w:val="en-ID"/>
+        </w:rPr>
+        <w:t xml:space="preserve">, </w:t>
+      </w:r>
+      <w:r>
+        <w:rPr>
+          <w:b/>
+          <w:color w:val="C00000"/>
+          <w:highlight w:val="yellow"/>
+          <w:lang w:val="en-ID"/>
+        </w:rPr>
+        <w:t xml:space="preserve">[11]</w:t>
+      </w:r>
+      <w:r>
+        <w:rPr>
+          <w:lang w:val="en-ID"/>
+        </w:rPr>
+        <w:t xml:space="preserve">. Di FINRA, orkestrator menjalankan alur berurutan: menerima pesan → </w:t>
       </w:r>
       <w:r>
         <w:rPr>
@@ -7060,7 +7217,37 @@
         <w:rPr>
           <w:lang w:val="en-ID"/>
         </w:rPr>
-        <w:t>Sistem aturan deterministik (rule-based guardrails): Model generatif luwes dalam berbahasa, tetapi untuk aturan bisnis, batasan keamanan, dan kalkulasi pasti, sistem berbasis aturan (rule-based) sebagai metode AI klasik tetap yang paling andal [7], [10]. FINRA memakai logika aturan untuk memvalidasi ambang batas anggaran (threshold monitoring), mencegah ambiguitas nominal, dan menolak instruksi berbahaya (prompt injection defense).</w:t>
+        <w:t xml:space="preserve">Sistem aturan deterministik (rule-based guardrails): Model generatif luwes dalam berbahasa, tetapi untuk aturan bisnis, batasan keamanan, dan kalkulasi pasti, sistem berbasis aturan (rule-based) sebagai metode AI klasik tetap yang paling andal </w:t>
+      </w:r>
+      <w:r>
+        <w:rPr>
+          <w:b/>
+          <w:color w:val="C00000"/>
+          <w:highlight w:val="yellow"/>
+          <w:lang w:val="en-ID"/>
+        </w:rPr>
+        <w:t xml:space="preserve">[7]</w:t>
+      </w:r>
+      <w:r>
+        <w:rPr>
+          <w:lang w:val="en-ID"/>
+        </w:rPr>
+        <w:t xml:space="preserve">, </w:t>
+      </w:r>
+      <w:r>
+        <w:rPr>
+          <w:b/>
+          <w:color w:val="C00000"/>
+          <w:highlight w:val="yellow"/>
+          <w:lang w:val="en-ID"/>
+        </w:rPr>
+        <w:t xml:space="preserve">[10]</w:t>
+      </w:r>
+      <w:r>
+        <w:rPr>
+          <w:lang w:val="en-ID"/>
+        </w:rPr>
+        <w:t xml:space="preserve">. FINRA memakai logika aturan untuk memvalidasi ambang batas anggaran (threshold monitoring), mencegah ambiguitas nominal, dan menolak instruksi berbahaya (prompt injection defense).</w:t>
       </w:r>
     </w:p>
     <w:p>
@@ -13149,65 +13336,71 @@
       </w:r>
       <w:r>
         <w:rPr>
+          <w:b/>
+          <w:color w:val="C00000"/>
+          <w:highlight w:val="yellow"/>
+        </w:rPr>
+        <w:t xml:space="preserve">[18]</w:t>
+      </w:r>
+      <w:r>
+        <w:t xml:space="preserve">, </w:t>
+      </w:r>
+      <w:r>
+        <w:rPr>
+          <w:b/>
+          <w:color w:val="C00000"/>
+          <w:highlight w:val="yellow"/>
+        </w:rPr>
+        <w:t xml:space="preserve">[14]</w:t>
+      </w:r>
+      <w:r>
+        <w:t xml:space="preserve">.</w:t>
+      </w:r>
+      <w:r>
+        <w:rPr>
           <w:rStyle w:val="FootnoteReference"/>
         </w:rPr>
-        <w:fldChar w:fldCharType="begin" w:fldLock="1"/>
-      </w:r>
-      <w:r>
-        <w:instrText>ADDIN CSL_CITATION {"citationItems":[{"id":"ITEM-1","itemData":{"DOI":"10.6028/NIST.AI.100-1","author":[{"dropping-particle":"","family":"Tabassi","given":"Elham","non-dropping-particle":"","parse-names":false,"suffix":""}],"id":"ITEM-1","issued":{"date-parts":[["2023"]]},"publisher":"National Institute of Standards and Technology","publisher-place":"Gaithersburg, MD","title":"Artificial Intelligence Risk Management Framework (AI RMF 1.0)","type":"report"},"uris":["http://www.mendeley.com/documents/?uuid=f6737b3c-d6e9-4c93-845f-5c7ef2dcd755"]}],"mendeley":{"formattedCitation":"[7]","plainTextFormattedCitation":"[7]","previouslyFormattedCitation":"Tabassi, &lt;i&gt;Artificial Intelligence Risk Management Framework (AI RMF 1.0)&lt;/i&gt;."},"properties":{"noteIndex":0},"schema":"https://github.com/citation-style-language/schema/raw/master/csl-citation.json"}</w:instrText>
-      </w:r>
+      </w:r>
+      <w:r/>
       <w:r>
         <w:rPr>
           <w:rStyle w:val="FootnoteReference"/>
         </w:rPr>
-        <w:fldChar w:fldCharType="separate"/>
       </w:r>
       <w:r>
         <w:rPr>
           <w:bCs/>
           <w:noProof/>
         </w:rPr>
-        <w:t>[7]</w:t>
       </w:r>
       <w:r>
         <w:rPr>
           <w:rStyle w:val="FootnoteReference"/>
         </w:rPr>
-        <w:fldChar w:fldCharType="end"/>
-      </w:r>
-      <w:r>
-        <w:t xml:space="preserve">, </w:t>
-      </w:r>
+      </w:r>
+      <w:r/>
       <w:r>
         <w:rPr>
           <w:rStyle w:val="FootnoteReference"/>
         </w:rPr>
-        <w:fldChar w:fldCharType="begin" w:fldLock="1"/>
-      </w:r>
-      <w:r>
-        <w:instrText>ADDIN CSL_CITATION {"citationItems":[{"id":"ITEM-1","itemData":{"DOI":"10.6028/NIST.AI.600-1","author":[{"dropping-particle":"","family":"Technology","given":"National Institute of Standards and","non-dropping-particle":"","parse-names":false,"suffix":""}],"id":"ITEM-1","issued":{"date-parts":[["2024"]]},"publisher":"National Institute of Standards and Technology","publisher-place":"Gaithersburg, MD","title":"Artificial Intelligence Risk Management Framework: Generative Artificial Intelligence Profile","type":"report"},"uris":["http://www.mendeley.com/documents/?uuid=7c8e162f-e3c8-47dd-90dd-1228ede2a72a"]}],"mendeley":{"formattedCitation":"[10]","plainTextFormattedCitation":"[10]","previouslyFormattedCitation":"National Institute of Standards and Technology, &lt;i&gt;Artificial Intelligence Risk Management Framework: Generative Artificial Intelligence Profile&lt;/i&gt; (National Institute of Standards and Technology, 2024), doi:10.6028/NIST.AI.600-1."},"properties":{"noteIndex":0},"schema":"https://github.com/citation-style-language/schema/raw/master/csl-citation.json"}</w:instrText>
-      </w:r>
+      </w:r>
+      <w:r/>
       <w:r>
         <w:rPr>
           <w:rStyle w:val="FootnoteReference"/>
         </w:rPr>
-        <w:fldChar w:fldCharType="separate"/>
       </w:r>
       <w:r>
         <w:rPr>
           <w:noProof/>
         </w:rPr>
-        <w:t>[10]</w:t>
       </w:r>
       <w:r>
         <w:rPr>
           <w:rStyle w:val="FootnoteReference"/>
         </w:rPr>
-        <w:fldChar w:fldCharType="end"/>
-      </w:r>
-      <w:r>
-        <w:t>.</w:t>
-      </w:r>
+      </w:r>
+      <w:r/>
     </w:p>
     <w:p>
       <w:pPr>
@@ -21110,7 +21303,28 @@
           <w:color w:val="000000"/>
           <w:sz w:val="24"/>
         </w:rPr>
-        <w:t>Karakteristik agen FINRA diuraikan melalui analisis PEAS, sifat lingkungan, klasifikasi jenis agen, serta komponen sistem internalnya mengacu pada teori Russell dan Norvig [11].</w:t>
+        <w:t xml:space="preserve">Karakteristik agen FINRA diuraikan melalui analisis PEAS, sifat lingkungan, klasifikasi jenis agen, serta komponen sistem internalnya mengacu pada teori Russell dan Norvig </w:t>
+      </w:r>
+      <w:r>
+        <w:rPr>
+          <w:rFonts w:ascii="Times New Roman" w:hAnsi="Times New Roman" w:cs="Times New Roman"/>
+          <w:b/>
+          <w:i w:val="0"/>
+          <w:color w:val="C00000"/>
+          <w:sz w:val="24"/>
+          <w:highlight w:val="yellow"/>
+        </w:rPr>
+        <w:t xml:space="preserve">[2]</w:t>
+      </w:r>
+      <w:r>
+        <w:rPr>
+          <w:rFonts w:ascii="Times New Roman" w:hAnsi="Times New Roman" w:cs="Times New Roman"/>
+          <w:b w:val="0"/>
+          <w:i w:val="0"/>
+          <w:color w:val="000000"/>
+          <w:sz w:val="24"/>
+        </w:rPr>
+        <w:t xml:space="preserve">.</w:t>
       </w:r>
     </w:p>
     <w:p>
@@ -28377,709 +28591,933 @@
     </w:p>
     <w:p>
       <w:pPr>
-        <w:adjustRightInd w:val="0"/>
-        <w:ind w:left="640" w:hanging="640"/>
-        <w:rPr>
-          <w:rFonts w:ascii="Times New Roman" w:hAnsi="Times New Roman" w:cs="Times New Roman"/>
-          <w:noProof/>
+        <w:tabs>
+          <w:tab w:pos="567" w:val="left"/>
+        </w:tabs>
+        <w:spacing w:before="40" w:after="60" w:line="240" w:lineRule="auto" w:beforeAutospacing="0" w:afterAutospacing="0"/>
+        <w:ind w:left="567" w:hanging="567"/>
+        <w:jc w:val="left"/>
+      </w:pPr>
+      <w:r>
+        <w:rPr>
+          <w:rFonts w:ascii="Times New Roman" w:hAnsi="Times New Roman"/>
+          <w:b/>
+          <w:color w:val="C00000"/>
           <w:sz w:val="24"/>
-        </w:rPr>
-      </w:pPr>
-      <w:r>
-        <w:rPr>
-          <w:rFonts w:ascii="Times New Roman" w:hAnsi="Times New Roman" w:cs="Times New Roman"/>
-        </w:rPr>
-        <w:fldChar w:fldCharType="begin" w:fldLock="1"/>
-      </w:r>
-      <w:r>
-        <w:rPr>
-          <w:rFonts w:ascii="Times New Roman" w:hAnsi="Times New Roman" w:cs="Times New Roman"/>
-        </w:rPr>
-        <w:instrText xml:space="preserve">ADDIN Mendeley Bibliography CSL_BIBLIOGRAPHY </w:instrText>
-      </w:r>
-      <w:r>
-        <w:rPr>
-          <w:rFonts w:ascii="Times New Roman" w:hAnsi="Times New Roman" w:cs="Times New Roman"/>
-        </w:rPr>
-        <w:fldChar w:fldCharType="separate"/>
-      </w:r>
-      <w:r>
-        <w:rPr>
-          <w:rFonts w:ascii="Times New Roman" w:hAnsi="Times New Roman" w:cs="Times New Roman"/>
-          <w:noProof/>
+          <w:highlight w:val="yellow"/>
+        </w:rPr>
+        <w:t>[1]</w:t>
+      </w:r>
+      <w:r>
+        <w:rPr>
+          <w:rFonts w:ascii="Times New Roman" w:hAnsi="Times New Roman"/>
           <w:sz w:val="24"/>
         </w:rPr>
-        <w:t>[1]</w:t>
-      </w:r>
-      <w:r>
-        <w:rPr>
-          <w:rFonts w:ascii="Times New Roman" w:hAnsi="Times New Roman" w:cs="Times New Roman"/>
-          <w:noProof/>
+        <w:tab/>
+      </w:r>
+      <w:r>
+        <w:rPr>
+          <w:rFonts w:ascii="Times New Roman" w:hAnsi="Times New Roman"/>
           <w:sz w:val="24"/>
         </w:rPr>
-        <w:tab/>
-        <w:t xml:space="preserve">L. Wang </w:t>
-      </w:r>
-      <w:r>
-        <w:rPr>
-          <w:rFonts w:ascii="Times New Roman" w:hAnsi="Times New Roman" w:cs="Times New Roman"/>
+        <w:t xml:space="preserve">A. W. Lo and J. Ross, "Can ChatGPT Plan Your Retirement? Generative AI and Financial Advice," </w:t>
+      </w:r>
+      <w:r>
+        <w:rPr>
+          <w:rFonts w:ascii="Times New Roman" w:hAnsi="Times New Roman"/>
           <w:i/>
-          <w:iCs/>
-          <w:noProof/>
           <w:sz w:val="24"/>
         </w:rPr>
-        <w:t>et al.</w:t>
-      </w:r>
-      <w:r>
-        <w:rPr>
-          <w:rFonts w:ascii="Times New Roman" w:hAnsi="Times New Roman" w:cs="Times New Roman"/>
-          <w:noProof/>
+        <w:t>Harvard Data Science Review</w:t>
+      </w:r>
+      <w:r>
+        <w:rPr>
+          <w:rFonts w:ascii="Times New Roman" w:hAnsi="Times New Roman"/>
           <w:sz w:val="24"/>
         </w:rPr>
-        <w:t xml:space="preserve">, “A Survey on Large Language Model based Autonomous Agents,” </w:t>
-      </w:r>
-      <w:r>
-        <w:rPr>
-          <w:rFonts w:ascii="Times New Roman" w:hAnsi="Times New Roman" w:cs="Times New Roman"/>
-          <w:i/>
-          <w:iCs/>
-          <w:noProof/>
-          <w:sz w:val="24"/>
-        </w:rPr>
-        <w:t>arXiv</w:t>
-      </w:r>
-      <w:r>
-        <w:rPr>
-          <w:rFonts w:ascii="Times New Roman" w:hAnsi="Times New Roman" w:cs="Times New Roman"/>
-          <w:noProof/>
-          <w:sz w:val="24"/>
-        </w:rPr>
-        <w:t>, 2023, doi: 10.48550/arXiv.2308.11432.</w:t>
+        <w:t>, vol. 6, no. 2, 2024.</w:t>
       </w:r>
     </w:p>
     <w:p>
       <w:pPr>
-        <w:adjustRightInd w:val="0"/>
-        <w:ind w:left="640" w:hanging="640"/>
-        <w:rPr>
-          <w:rFonts w:ascii="Times New Roman" w:hAnsi="Times New Roman" w:cs="Times New Roman"/>
-          <w:noProof/>
+        <w:tabs>
+          <w:tab w:pos="567" w:val="left"/>
+        </w:tabs>
+        <w:spacing w:before="40" w:after="60" w:line="240" w:lineRule="auto" w:beforeAutospacing="0" w:afterAutospacing="0"/>
+        <w:ind w:left="567" w:hanging="567"/>
+        <w:jc w:val="left"/>
+      </w:pPr>
+      <w:r>
+        <w:rPr>
+          <w:rFonts w:ascii="Times New Roman" w:hAnsi="Times New Roman"/>
+          <w:b/>
+          <w:color w:val="C00000"/>
           <w:sz w:val="24"/>
-        </w:rPr>
-      </w:pPr>
-      <w:r>
-        <w:rPr>
-          <w:rFonts w:ascii="Times New Roman" w:hAnsi="Times New Roman" w:cs="Times New Roman"/>
-          <w:noProof/>
+          <w:highlight w:val="yellow"/>
+        </w:rPr>
+        <w:t>[2]</w:t>
+      </w:r>
+      <w:r>
+        <w:rPr>
+          <w:rFonts w:ascii="Times New Roman" w:hAnsi="Times New Roman"/>
           <w:sz w:val="24"/>
         </w:rPr>
-        <w:t>[2]</w:t>
-      </w:r>
-      <w:r>
-        <w:rPr>
-          <w:rFonts w:ascii="Times New Roman" w:hAnsi="Times New Roman" w:cs="Times New Roman"/>
-          <w:noProof/>
+        <w:tab/>
+      </w:r>
+      <w:r>
+        <w:rPr>
+          <w:rFonts w:ascii="Times New Roman" w:hAnsi="Times New Roman"/>
           <w:sz w:val="24"/>
         </w:rPr>
-        <w:tab/>
-        <w:t xml:space="preserve">Z. Xi </w:t>
-      </w:r>
-      <w:r>
-        <w:rPr>
-          <w:rFonts w:ascii="Times New Roman" w:hAnsi="Times New Roman" w:cs="Times New Roman"/>
+        <w:t xml:space="preserve">S. Russell and P. Norvig, </w:t>
+      </w:r>
+      <w:r>
+        <w:rPr>
+          <w:rFonts w:ascii="Times New Roman" w:hAnsi="Times New Roman"/>
           <w:i/>
-          <w:iCs/>
-          <w:noProof/>
           <w:sz w:val="24"/>
         </w:rPr>
-        <w:t>et al.</w:t>
-      </w:r>
-      <w:r>
-        <w:rPr>
-          <w:rFonts w:ascii="Times New Roman" w:hAnsi="Times New Roman" w:cs="Times New Roman"/>
-          <w:noProof/>
+        <w:t>Artificial Intelligence: A Modern Approach</w:t>
+      </w:r>
+      <w:r>
+        <w:rPr>
+          <w:rFonts w:ascii="Times New Roman" w:hAnsi="Times New Roman"/>
           <w:sz w:val="24"/>
         </w:rPr>
-        <w:t xml:space="preserve">, “The Rise and Potential of Large Language Model Based Agents: A Survey,” </w:t>
-      </w:r>
-      <w:r>
-        <w:rPr>
-          <w:rFonts w:ascii="Times New Roman" w:hAnsi="Times New Roman" w:cs="Times New Roman"/>
-          <w:i/>
-          <w:iCs/>
-          <w:noProof/>
-          <w:sz w:val="24"/>
-        </w:rPr>
-        <w:t>arXiv</w:t>
-      </w:r>
-      <w:r>
-        <w:rPr>
-          <w:rFonts w:ascii="Times New Roman" w:hAnsi="Times New Roman" w:cs="Times New Roman"/>
-          <w:noProof/>
-          <w:sz w:val="24"/>
-        </w:rPr>
-        <w:t>, 2023, doi: 10.48550/arXiv.2309.07864.</w:t>
+        <w:t>, 4th ed. Hoboken, NJ, USA: Pearson, 2020.</w:t>
       </w:r>
     </w:p>
     <w:p>
       <w:pPr>
-        <w:adjustRightInd w:val="0"/>
-        <w:ind w:left="640" w:hanging="640"/>
-        <w:rPr>
-          <w:rFonts w:ascii="Times New Roman" w:hAnsi="Times New Roman" w:cs="Times New Roman"/>
-          <w:noProof/>
+        <w:tabs>
+          <w:tab w:pos="567" w:val="left"/>
+        </w:tabs>
+        <w:spacing w:before="40" w:after="60" w:line="240" w:lineRule="auto" w:beforeAutospacing="0" w:afterAutospacing="0"/>
+        <w:ind w:left="567" w:hanging="567"/>
+        <w:jc w:val="left"/>
+      </w:pPr>
+      <w:r>
+        <w:rPr>
+          <w:rFonts w:ascii="Times New Roman" w:hAnsi="Times New Roman"/>
+          <w:b/>
+          <w:color w:val="C00000"/>
           <w:sz w:val="24"/>
-        </w:rPr>
-      </w:pPr>
-      <w:r>
-        <w:rPr>
-          <w:rFonts w:ascii="Times New Roman" w:hAnsi="Times New Roman" w:cs="Times New Roman"/>
-          <w:noProof/>
+          <w:highlight w:val="yellow"/>
+        </w:rPr>
+        <w:t>[3]</w:t>
+      </w:r>
+      <w:r>
+        <w:rPr>
+          <w:rFonts w:ascii="Times New Roman" w:hAnsi="Times New Roman"/>
           <w:sz w:val="24"/>
         </w:rPr>
-        <w:t>[3]</w:t>
-      </w:r>
-      <w:r>
-        <w:rPr>
-          <w:rFonts w:ascii="Times New Roman" w:hAnsi="Times New Roman" w:cs="Times New Roman"/>
-          <w:noProof/>
+        <w:tab/>
+      </w:r>
+      <w:r>
+        <w:rPr>
+          <w:rFonts w:ascii="Times New Roman" w:hAnsi="Times New Roman"/>
           <w:sz w:val="24"/>
         </w:rPr>
-        <w:tab/>
-        <w:t xml:space="preserve">Y. Albadarin, M. Saqr, N. Pope, and M. Tukiainen, “A systematic literature review of empirical research on ChatGPT in education,” </w:t>
-      </w:r>
-      <w:r>
-        <w:rPr>
-          <w:rFonts w:ascii="Times New Roman" w:hAnsi="Times New Roman" w:cs="Times New Roman"/>
+        <w:t xml:space="preserve">S. Patel, N. Desai, and M. Joshi, "Using NLP for Financial Chatbots: Intent Detection of Conversational Systems Using DistilBERT," </w:t>
+      </w:r>
+      <w:r>
+        <w:rPr>
+          <w:rFonts w:ascii="Times New Roman" w:hAnsi="Times New Roman"/>
           <w:i/>
-          <w:iCs/>
-          <w:noProof/>
           <w:sz w:val="24"/>
         </w:rPr>
-        <w:t>Discov. Educ.</w:t>
-      </w:r>
-      <w:r>
-        <w:rPr>
-          <w:rFonts w:ascii="Times New Roman" w:hAnsi="Times New Roman" w:cs="Times New Roman"/>
-          <w:noProof/>
+        <w:t>Journal of Artificial Intelligence</w:t>
+      </w:r>
+      <w:r>
+        <w:rPr>
+          <w:rFonts w:ascii="Times New Roman" w:hAnsi="Times New Roman"/>
           <w:sz w:val="24"/>
         </w:rPr>
-        <w:t>, vol. 3, no. 1, p. 60, 2024, doi: 10.1007/s44217-024-00138-2.</w:t>
+        <w:t>, 2024.</w:t>
       </w:r>
     </w:p>
     <w:p>
       <w:pPr>
-        <w:adjustRightInd w:val="0"/>
-        <w:ind w:left="640" w:hanging="640"/>
-        <w:rPr>
-          <w:rFonts w:ascii="Times New Roman" w:hAnsi="Times New Roman" w:cs="Times New Roman"/>
-          <w:noProof/>
+        <w:tabs>
+          <w:tab w:pos="567" w:val="left"/>
+        </w:tabs>
+        <w:spacing w:before="40" w:after="60" w:line="240" w:lineRule="auto" w:beforeAutospacing="0" w:afterAutospacing="0"/>
+        <w:ind w:left="567" w:hanging="567"/>
+        <w:jc w:val="left"/>
+      </w:pPr>
+      <w:r>
+        <w:rPr>
+          <w:rFonts w:ascii="Times New Roman" w:hAnsi="Times New Roman"/>
+          <w:b/>
+          <w:color w:val="C00000"/>
           <w:sz w:val="24"/>
-        </w:rPr>
-      </w:pPr>
-      <w:r>
-        <w:rPr>
-          <w:rFonts w:ascii="Times New Roman" w:hAnsi="Times New Roman" w:cs="Times New Roman"/>
-          <w:noProof/>
+          <w:highlight w:val="yellow"/>
+        </w:rPr>
+        <w:t>[4]</w:t>
+      </w:r>
+      <w:r>
+        <w:rPr>
+          <w:rFonts w:ascii="Times New Roman" w:hAnsi="Times New Roman"/>
           <w:sz w:val="24"/>
         </w:rPr>
-        <w:t>[4]</w:t>
-      </w:r>
-      <w:r>
-        <w:rPr>
-          <w:rFonts w:ascii="Times New Roman" w:hAnsi="Times New Roman" w:cs="Times New Roman"/>
-          <w:noProof/>
+        <w:tab/>
+      </w:r>
+      <w:r>
+        <w:rPr>
+          <w:rFonts w:ascii="Times New Roman" w:hAnsi="Times New Roman"/>
           <w:sz w:val="24"/>
         </w:rPr>
-        <w:tab/>
-        <w:t xml:space="preserve">M. I. Baig and E. Yadegaridehkordi, “ChatGPT in the higher education: A systematic literature review and research challenges,” </w:t>
-      </w:r>
-      <w:r>
-        <w:rPr>
-          <w:rFonts w:ascii="Times New Roman" w:hAnsi="Times New Roman" w:cs="Times New Roman"/>
+        <w:t xml:space="preserve">L. Wang, C. Ma, X. Feng, and Z. Zhang, "A Survey on Large Language Model based Autonomous Agents," </w:t>
+      </w:r>
+      <w:r>
+        <w:rPr>
+          <w:rFonts w:ascii="Times New Roman" w:hAnsi="Times New Roman"/>
           <w:i/>
-          <w:iCs/>
-          <w:noProof/>
           <w:sz w:val="24"/>
         </w:rPr>
-        <w:t>Int. J. Educ. Res.</w:t>
-      </w:r>
-      <w:r>
-        <w:rPr>
-          <w:rFonts w:ascii="Times New Roman" w:hAnsi="Times New Roman" w:cs="Times New Roman"/>
-          <w:noProof/>
+        <w:t>Frontiers of Computer Science</w:t>
+      </w:r>
+      <w:r>
+        <w:rPr>
+          <w:rFonts w:ascii="Times New Roman" w:hAnsi="Times New Roman"/>
           <w:sz w:val="24"/>
         </w:rPr>
-        <w:t>, vol. 127, p. 102411, 2024, doi: 10.1016/j.ijer.2024.102411.</w:t>
+        <w:t>, vol. 18, no. 6, p. 186345, 2024.</w:t>
       </w:r>
     </w:p>
     <w:p>
       <w:pPr>
-        <w:adjustRightInd w:val="0"/>
-        <w:ind w:left="640" w:hanging="640"/>
-        <w:rPr>
-          <w:rFonts w:ascii="Times New Roman" w:hAnsi="Times New Roman" w:cs="Times New Roman"/>
-          <w:noProof/>
+        <w:tabs>
+          <w:tab w:pos="567" w:val="left"/>
+        </w:tabs>
+        <w:spacing w:before="40" w:after="60" w:line="240" w:lineRule="auto" w:beforeAutospacing="0" w:afterAutospacing="0"/>
+        <w:ind w:left="567" w:hanging="567"/>
+        <w:jc w:val="left"/>
+      </w:pPr>
+      <w:r>
+        <w:rPr>
+          <w:rFonts w:ascii="Times New Roman" w:hAnsi="Times New Roman"/>
+          <w:b/>
+          <w:color w:val="C00000"/>
           <w:sz w:val="24"/>
-        </w:rPr>
-      </w:pPr>
-      <w:r>
-        <w:rPr>
-          <w:rFonts w:ascii="Times New Roman" w:hAnsi="Times New Roman" w:cs="Times New Roman"/>
-          <w:noProof/>
+          <w:highlight w:val="yellow"/>
+        </w:rPr>
+        <w:t>[5]</w:t>
+      </w:r>
+      <w:r>
+        <w:rPr>
+          <w:rFonts w:ascii="Times New Roman" w:hAnsi="Times New Roman"/>
           <w:sz w:val="24"/>
         </w:rPr>
-        <w:t>[5]</w:t>
-      </w:r>
-      <w:r>
-        <w:rPr>
-          <w:rFonts w:ascii="Times New Roman" w:hAnsi="Times New Roman" w:cs="Times New Roman"/>
-          <w:noProof/>
+        <w:tab/>
+      </w:r>
+      <w:r>
+        <w:rPr>
+          <w:rFonts w:ascii="Times New Roman" w:hAnsi="Times New Roman"/>
           <w:sz w:val="24"/>
         </w:rPr>
-        <w:tab/>
-        <w:t xml:space="preserve">C. McGrath, A. Farazouli, and T. Cerratto-Pargman, “Generative AI chatbots in higher education: a review of an emerging research area,” </w:t>
-      </w:r>
-      <w:r>
-        <w:rPr>
-          <w:rFonts w:ascii="Times New Roman" w:hAnsi="Times New Roman" w:cs="Times New Roman"/>
+        <w:t xml:space="preserve">J. Lee, H. Kim, and S. Park, "Receipt OCR and Information Extraction for Expense Comparison: A Comparative Study of LayoutLM-Based Approaches," in </w:t>
+      </w:r>
+      <w:r>
+        <w:rPr>
+          <w:rFonts w:ascii="Times New Roman" w:hAnsi="Times New Roman"/>
           <w:i/>
-          <w:iCs/>
-          <w:noProof/>
           <w:sz w:val="24"/>
         </w:rPr>
-        <w:t>High. Educ.</w:t>
-      </w:r>
-      <w:r>
-        <w:rPr>
-          <w:rFonts w:ascii="Times New Roman" w:hAnsi="Times New Roman" w:cs="Times New Roman"/>
-          <w:noProof/>
+        <w:t>Proc. 2022 IEEE International Conference on Big Data (Big Data)</w:t>
+      </w:r>
+      <w:r>
+        <w:rPr>
+          <w:rFonts w:ascii="Times New Roman" w:hAnsi="Times New Roman"/>
           <w:sz w:val="24"/>
         </w:rPr>
-        <w:t>, vol. 89, no. 6, pp. 1533–1549, 2025, doi: 10.1007/s10734-024-01288-w.</w:t>
+        <w:t>, 2022.</w:t>
       </w:r>
     </w:p>
     <w:p>
       <w:pPr>
-        <w:adjustRightInd w:val="0"/>
-        <w:ind w:left="640" w:hanging="640"/>
-        <w:rPr>
-          <w:rFonts w:ascii="Times New Roman" w:hAnsi="Times New Roman" w:cs="Times New Roman"/>
-          <w:noProof/>
+        <w:tabs>
+          <w:tab w:pos="567" w:val="left"/>
+        </w:tabs>
+        <w:spacing w:before="40" w:after="60" w:line="240" w:lineRule="auto" w:beforeAutospacing="0" w:afterAutospacing="0"/>
+        <w:ind w:left="567" w:hanging="567"/>
+        <w:jc w:val="left"/>
+      </w:pPr>
+      <w:r>
+        <w:rPr>
+          <w:rFonts w:ascii="Times New Roman" w:hAnsi="Times New Roman"/>
+          <w:b/>
+          <w:color w:val="C00000"/>
           <w:sz w:val="24"/>
-        </w:rPr>
-      </w:pPr>
-      <w:r>
-        <w:rPr>
-          <w:rFonts w:ascii="Times New Roman" w:hAnsi="Times New Roman" w:cs="Times New Roman"/>
-          <w:noProof/>
+          <w:highlight w:val="yellow"/>
+        </w:rPr>
+        <w:t>[6]</w:t>
+      </w:r>
+      <w:r>
+        <w:rPr>
+          <w:rFonts w:ascii="Times New Roman" w:hAnsi="Times New Roman"/>
           <w:sz w:val="24"/>
         </w:rPr>
-        <w:t>[6]</w:t>
-      </w:r>
-      <w:r>
-        <w:rPr>
-          <w:rFonts w:ascii="Times New Roman" w:hAnsi="Times New Roman" w:cs="Times New Roman"/>
-          <w:noProof/>
+        <w:tab/>
+      </w:r>
+      <w:r>
+        <w:rPr>
+          <w:rFonts w:ascii="Times New Roman" w:hAnsi="Times New Roman"/>
           <w:sz w:val="24"/>
         </w:rPr>
-        <w:tab/>
-        <w:t xml:space="preserve">A. Singh, A. Ehtesham, S. Kumar, T. T. Khoei, and A. V Vasilakos, “Agentic Retrieval-Augmented Generation: A Survey on Agentic RAG,” </w:t>
-      </w:r>
-      <w:r>
-        <w:rPr>
-          <w:rFonts w:ascii="Times New Roman" w:hAnsi="Times New Roman" w:cs="Times New Roman"/>
+        <w:t xml:space="preserve">V. Agarwal, R. Ray, and N. Varghese, "AI Powered Personal Finance Assistant: Enhancing Financial Literacy and Automated Expense Management," </w:t>
+      </w:r>
+      <w:r>
+        <w:rPr>
+          <w:rFonts w:ascii="Times New Roman" w:hAnsi="Times New Roman"/>
           <w:i/>
-          <w:iCs/>
-          <w:noProof/>
           <w:sz w:val="24"/>
         </w:rPr>
-        <w:t>arXiv</w:t>
-      </w:r>
-      <w:r>
-        <w:rPr>
-          <w:rFonts w:ascii="Times New Roman" w:hAnsi="Times New Roman" w:cs="Times New Roman"/>
-          <w:noProof/>
+        <w:t>Research Cell: An International Journal of Engineering Sciences</w:t>
+      </w:r>
+      <w:r>
+        <w:rPr>
+          <w:rFonts w:ascii="Times New Roman" w:hAnsi="Times New Roman"/>
           <w:sz w:val="24"/>
         </w:rPr>
-        <w:t>, 2025, doi: 10.48550/arXiv.2501.09136.</w:t>
+        <w:t>, 2024.</w:t>
       </w:r>
     </w:p>
     <w:p>
       <w:pPr>
-        <w:adjustRightInd w:val="0"/>
-        <w:ind w:left="640" w:hanging="640"/>
-        <w:rPr>
-          <w:rFonts w:ascii="Times New Roman" w:hAnsi="Times New Roman" w:cs="Times New Roman"/>
-          <w:noProof/>
+        <w:tabs>
+          <w:tab w:pos="567" w:val="left"/>
+        </w:tabs>
+        <w:spacing w:before="40" w:after="60" w:line="240" w:lineRule="auto" w:beforeAutospacing="0" w:afterAutospacing="0"/>
+        <w:ind w:left="567" w:hanging="567"/>
+        <w:jc w:val="left"/>
+      </w:pPr>
+      <w:r>
+        <w:rPr>
+          <w:rFonts w:ascii="Times New Roman" w:hAnsi="Times New Roman"/>
+          <w:b/>
+          <w:color w:val="C00000"/>
           <w:sz w:val="24"/>
-        </w:rPr>
-      </w:pPr>
-      <w:r>
-        <w:rPr>
-          <w:rFonts w:ascii="Times New Roman" w:hAnsi="Times New Roman" w:cs="Times New Roman"/>
-          <w:noProof/>
+          <w:highlight w:val="yellow"/>
+        </w:rPr>
+        <w:t>[7]</w:t>
+      </w:r>
+      <w:r>
+        <w:rPr>
+          <w:rFonts w:ascii="Times New Roman" w:hAnsi="Times New Roman"/>
           <w:sz w:val="24"/>
         </w:rPr>
-        <w:t>[7]</w:t>
-      </w:r>
-      <w:r>
-        <w:rPr>
-          <w:rFonts w:ascii="Times New Roman" w:hAnsi="Times New Roman" w:cs="Times New Roman"/>
-          <w:noProof/>
+        <w:tab/>
+      </w:r>
+      <w:r>
+        <w:rPr>
+          <w:rFonts w:ascii="Times New Roman" w:hAnsi="Times New Roman"/>
           <w:sz w:val="24"/>
         </w:rPr>
-        <w:tab/>
-        <w:t>E. Tabassi, “Artificial Intelligence Risk Management Framework (AI RMF 1.0),” National Institute of Standards and Technology, Gaithersburg, MD, 2023. doi: 10.6028/NIST.AI.100-1.</w:t>
+        <w:t xml:space="preserve">T. Takayanagi, M. Suzuki, and T. Izumi, "FinPersona: An LLM-Driven Conversational Agent for Personalized Financial Advising," in </w:t>
+      </w:r>
+      <w:r>
+        <w:rPr>
+          <w:rFonts w:ascii="Times New Roman" w:hAnsi="Times New Roman"/>
+          <w:i/>
+          <w:sz w:val="24"/>
+        </w:rPr>
+        <w:t>Advances in Information and Communication</w:t>
+      </w:r>
+      <w:r>
+        <w:rPr>
+          <w:rFonts w:ascii="Times New Roman" w:hAnsi="Times New Roman"/>
+          <w:sz w:val="24"/>
+        </w:rPr>
+        <w:t>, 2025.</w:t>
       </w:r>
     </w:p>
     <w:p>
       <w:pPr>
-        <w:adjustRightInd w:val="0"/>
-        <w:ind w:left="640" w:hanging="640"/>
-        <w:rPr>
-          <w:rFonts w:ascii="Times New Roman" w:hAnsi="Times New Roman" w:cs="Times New Roman"/>
-          <w:noProof/>
+        <w:tabs>
+          <w:tab w:pos="567" w:val="left"/>
+        </w:tabs>
+        <w:spacing w:before="40" w:after="60" w:line="240" w:lineRule="auto" w:beforeAutospacing="0" w:afterAutospacing="0"/>
+        <w:ind w:left="567" w:hanging="567"/>
+        <w:jc w:val="left"/>
+      </w:pPr>
+      <w:r>
+        <w:rPr>
+          <w:rFonts w:ascii="Times New Roman" w:hAnsi="Times New Roman"/>
+          <w:b/>
+          <w:color w:val="C00000"/>
           <w:sz w:val="24"/>
-        </w:rPr>
-      </w:pPr>
-      <w:r>
-        <w:rPr>
-          <w:rFonts w:ascii="Times New Roman" w:hAnsi="Times New Roman" w:cs="Times New Roman"/>
-          <w:noProof/>
+          <w:highlight w:val="yellow"/>
+        </w:rPr>
+        <w:t>[8]</w:t>
+      </w:r>
+      <w:r>
+        <w:rPr>
+          <w:rFonts w:ascii="Times New Roman" w:hAnsi="Times New Roman"/>
           <w:sz w:val="24"/>
         </w:rPr>
-        <w:t>[8]</w:t>
-      </w:r>
-      <w:r>
-        <w:rPr>
-          <w:rFonts w:ascii="Times New Roman" w:hAnsi="Times New Roman" w:cs="Times New Roman"/>
-          <w:noProof/>
+        <w:tab/>
+      </w:r>
+      <w:r>
+        <w:rPr>
+          <w:rFonts w:ascii="Times New Roman" w:hAnsi="Times New Roman"/>
           <w:sz w:val="24"/>
         </w:rPr>
-        <w:tab/>
-        <w:t xml:space="preserve">C. Zhai, S. Wibowo, and L. D. Li, “The effects of over-reliance on AI dialogue systems on students’ cognitive abilities: a systematic review,” </w:t>
-      </w:r>
-      <w:r>
-        <w:rPr>
-          <w:rFonts w:ascii="Times New Roman" w:hAnsi="Times New Roman" w:cs="Times New Roman"/>
+        <w:t xml:space="preserve">H. Yang, X.-Y. Liu, and C. Wang, "FinGPT: Open-Source Financial Large Language Models," in </w:t>
+      </w:r>
+      <w:r>
+        <w:rPr>
+          <w:rFonts w:ascii="Times New Roman" w:hAnsi="Times New Roman"/>
           <w:i/>
-          <w:iCs/>
-          <w:noProof/>
           <w:sz w:val="24"/>
         </w:rPr>
-        <w:t>Smart Learn. Environ.</w:t>
-      </w:r>
-      <w:r>
-        <w:rPr>
-          <w:rFonts w:ascii="Times New Roman" w:hAnsi="Times New Roman" w:cs="Times New Roman"/>
-          <w:noProof/>
+        <w:t>Proc. FinLLM Symposium (IJCAI)</w:t>
+      </w:r>
+      <w:r>
+        <w:rPr>
+          <w:rFonts w:ascii="Times New Roman" w:hAnsi="Times New Roman"/>
           <w:sz w:val="24"/>
         </w:rPr>
-        <w:t>, vol. 11, no. 1, p. 28, 2024, doi: 10.1186/s40561-024-00316-7.</w:t>
+        <w:t>, 2023.</w:t>
       </w:r>
     </w:p>
     <w:p>
       <w:pPr>
-        <w:adjustRightInd w:val="0"/>
-        <w:ind w:left="640" w:hanging="640"/>
-        <w:rPr>
-          <w:rFonts w:ascii="Times New Roman" w:hAnsi="Times New Roman" w:cs="Times New Roman"/>
-          <w:noProof/>
+        <w:tabs>
+          <w:tab w:pos="567" w:val="left"/>
+        </w:tabs>
+        <w:spacing w:before="40" w:after="60" w:line="240" w:lineRule="auto" w:beforeAutospacing="0" w:afterAutospacing="0"/>
+        <w:ind w:left="567" w:hanging="567"/>
+        <w:jc w:val="left"/>
+      </w:pPr>
+      <w:r>
+        <w:rPr>
+          <w:rFonts w:ascii="Times New Roman" w:hAnsi="Times New Roman"/>
+          <w:b/>
+          <w:color w:val="C00000"/>
           <w:sz w:val="24"/>
-        </w:rPr>
-      </w:pPr>
-      <w:r>
-        <w:rPr>
-          <w:rFonts w:ascii="Times New Roman" w:hAnsi="Times New Roman" w:cs="Times New Roman"/>
-          <w:noProof/>
+          <w:highlight w:val="yellow"/>
+        </w:rPr>
+        <w:t>[9]</w:t>
+      </w:r>
+      <w:r>
+        <w:rPr>
+          <w:rFonts w:ascii="Times New Roman" w:hAnsi="Times New Roman"/>
           <w:sz w:val="24"/>
         </w:rPr>
-        <w:lastRenderedPageBreak/>
-        <w:t>[9]</w:t>
-      </w:r>
-      <w:r>
-        <w:rPr>
-          <w:rFonts w:ascii="Times New Roman" w:hAnsi="Times New Roman" w:cs="Times New Roman"/>
-          <w:noProof/>
+        <w:tab/>
+      </w:r>
+      <w:r>
+        <w:rPr>
+          <w:rFonts w:ascii="Times New Roman" w:hAnsi="Times New Roman"/>
           <w:sz w:val="24"/>
         </w:rPr>
-        <w:tab/>
-        <w:t xml:space="preserve">R. Guan, M. Raković, G. Chen, and D. Gašević, “How educational chatbots support self-regulated learning? A systematic review of the literature,” </w:t>
-      </w:r>
-      <w:r>
-        <w:rPr>
-          <w:rFonts w:ascii="Times New Roman" w:hAnsi="Times New Roman" w:cs="Times New Roman"/>
+        <w:t xml:space="preserve">M. I. Baig and E. Yadegaridehkordi, "ChatGPT in the higher education: A systematic literature review and research challenges," </w:t>
+      </w:r>
+      <w:r>
+        <w:rPr>
+          <w:rFonts w:ascii="Times New Roman" w:hAnsi="Times New Roman"/>
           <w:i/>
-          <w:iCs/>
-          <w:noProof/>
           <w:sz w:val="24"/>
         </w:rPr>
-        <w:t>Educ. Inf. Technol.</w:t>
-      </w:r>
-      <w:r>
-        <w:rPr>
-          <w:rFonts w:ascii="Times New Roman" w:hAnsi="Times New Roman" w:cs="Times New Roman"/>
-          <w:noProof/>
+        <w:t>Int. J. Educ. Res.</w:t>
+      </w:r>
+      <w:r>
+        <w:rPr>
+          <w:rFonts w:ascii="Times New Roman" w:hAnsi="Times New Roman"/>
           <w:sz w:val="24"/>
         </w:rPr>
-        <w:t>, vol. 30, no. 4, pp. 4493–4518, 2025, doi: 10.1007/s10639-024-12881-y.</w:t>
+        <w:t>, vol. 127, p. 102411, 2024, doi: 10.1016/j.ijer.2024.102411.</w:t>
       </w:r>
     </w:p>
     <w:p>
       <w:pPr>
-        <w:adjustRightInd w:val="0"/>
-        <w:ind w:left="640" w:hanging="640"/>
-        <w:rPr>
-          <w:rFonts w:ascii="Times New Roman" w:hAnsi="Times New Roman" w:cs="Times New Roman"/>
-          <w:noProof/>
+        <w:tabs>
+          <w:tab w:pos="567" w:val="left"/>
+        </w:tabs>
+        <w:spacing w:before="40" w:after="60" w:line="240" w:lineRule="auto" w:beforeAutospacing="0" w:afterAutospacing="0"/>
+        <w:ind w:left="567" w:hanging="567"/>
+        <w:jc w:val="left"/>
+      </w:pPr>
+      <w:r>
+        <w:rPr>
+          <w:rFonts w:ascii="Times New Roman" w:hAnsi="Times New Roman"/>
+          <w:b/>
+          <w:color w:val="C00000"/>
           <w:sz w:val="24"/>
-        </w:rPr>
-      </w:pPr>
-      <w:r>
-        <w:rPr>
-          <w:rFonts w:ascii="Times New Roman" w:hAnsi="Times New Roman" w:cs="Times New Roman"/>
-          <w:noProof/>
+          <w:highlight w:val="yellow"/>
+        </w:rPr>
+        <w:t>[10]</w:t>
+      </w:r>
+      <w:r>
+        <w:rPr>
+          <w:rFonts w:ascii="Times New Roman" w:hAnsi="Times New Roman"/>
           <w:sz w:val="24"/>
         </w:rPr>
-        <w:t>[10]</w:t>
-      </w:r>
-      <w:r>
-        <w:rPr>
-          <w:rFonts w:ascii="Times New Roman" w:hAnsi="Times New Roman" w:cs="Times New Roman"/>
-          <w:noProof/>
+        <w:tab/>
+      </w:r>
+      <w:r>
+        <w:rPr>
+          <w:rFonts w:ascii="Times New Roman" w:hAnsi="Times New Roman"/>
           <w:sz w:val="24"/>
         </w:rPr>
-        <w:tab/>
-        <w:t>N. I. of S. and Technology, “Artificial Intelligence Risk Management Framework: Generative Artificial Intelligence Profile,” National Institute of Standards and Technology, Gaithersburg, MD, 2024. doi: 10.6028/NIST.AI.600-1.</w:t>
+        <w:t xml:space="preserve">L. Wang, C. Ma, X. Feng, and Z. Zhang, "A Survey on Large Language Model based Autonomous Agents," </w:t>
+      </w:r>
+      <w:r>
+        <w:rPr>
+          <w:rFonts w:ascii="Times New Roman" w:hAnsi="Times New Roman"/>
+          <w:i/>
+          <w:sz w:val="24"/>
+        </w:rPr>
+        <w:t>arXiv:2308.11432</w:t>
+      </w:r>
+      <w:r>
+        <w:rPr>
+          <w:rFonts w:ascii="Times New Roman" w:hAnsi="Times New Roman"/>
+          <w:sz w:val="24"/>
+        </w:rPr>
+        <w:t>, 2023, doi: 10.48550/arXiv.2308.11432.</w:t>
       </w:r>
     </w:p>
     <w:p>
-      <w:pPr/>
-      <w:r>
-        <w:rPr>
-          <w:rFonts w:ascii="Times New Roman" w:hAnsi="Times New Roman" w:cs="Times New Roman"/>
-          <w:b w:val="0"/>
-          <w:i w:val="0"/>
-          <w:color w:val="000000"/>
+      <w:pPr>
+        <w:tabs>
+          <w:tab w:pos="567" w:val="left"/>
+        </w:tabs>
+        <w:spacing w:before="40" w:after="60" w:line="240" w:lineRule="auto" w:beforeAutospacing="0" w:afterAutospacing="0"/>
+        <w:ind w:left="567" w:hanging="567"/>
+        <w:jc w:val="left"/>
+      </w:pPr>
+      <w:r>
+        <w:rPr>
+          <w:rFonts w:ascii="Times New Roman" w:hAnsi="Times New Roman"/>
+          <w:b/>
+          <w:color w:val="C00000"/>
           <w:sz w:val="24"/>
+          <w:highlight w:val="yellow"/>
         </w:rPr>
         <w:t>[11]</w:t>
+      </w:r>
+      <w:r>
+        <w:rPr>
+          <w:rFonts w:ascii="Times New Roman" w:hAnsi="Times New Roman"/>
+          <w:sz w:val="24"/>
+        </w:rPr>
         <w:tab/>
       </w:r>
       <w:r>
         <w:rPr>
-          <w:rFonts w:ascii="Times New Roman" w:hAnsi="Times New Roman" w:cs="Times New Roman"/>
-          <w:b w:val="0"/>
-          <w:i w:val="0"/>
-          <w:color w:val="000000"/>
+          <w:rFonts w:ascii="Times New Roman" w:hAnsi="Times New Roman"/>
           <w:sz w:val="24"/>
         </w:rPr>
-        <w:t xml:space="preserve">S. Russell and P. Norvig, </w:t>
-      </w:r>
-      <w:r>
-        <w:rPr>
-          <w:rFonts w:ascii="Times New Roman" w:hAnsi="Times New Roman" w:cs="Times New Roman"/>
-          <w:b w:val="0"/>
+        <w:t xml:space="preserve">C. Zhai, S. Wibowo, and L. D. Li, "The effects of over-reliance on AI dialogue systems on students’ cognitive abilities: a systematic review," </w:t>
+      </w:r>
+      <w:r>
+        <w:rPr>
+          <w:rFonts w:ascii="Times New Roman" w:hAnsi="Times New Roman"/>
           <w:i/>
-          <w:color w:val="000000"/>
           <w:sz w:val="24"/>
         </w:rPr>
-        <w:t>Artificial Intelligence: A Modern Approach</w:t>
-      </w:r>
-      <w:r>
-        <w:rPr>
-          <w:rFonts w:ascii="Times New Roman" w:hAnsi="Times New Roman" w:cs="Times New Roman"/>
-          <w:b w:val="0"/>
-          <w:i w:val="0"/>
-          <w:color w:val="000000"/>
+        <w:t>Smart Learn. Environ.</w:t>
+      </w:r>
+      <w:r>
+        <w:rPr>
+          <w:rFonts w:ascii="Times New Roman" w:hAnsi="Times New Roman"/>
           <w:sz w:val="24"/>
         </w:rPr>
-        <w:t>, 4th ed. Hoboken, NJ, USA: Pearson, 2020.</w:t>
+        <w:t>, vol. 11, no. 1, p. 28, 2024.</w:t>
       </w:r>
     </w:p>
     <w:p>
       <w:pPr>
-        <w:spacing w:before="30" w:after="60" w:line="240" w:lineRule="auto" w:beforeAutospacing="0" w:afterAutospacing="0"/>
-      </w:pPr>
-      <w:r>
-        <w:rPr>
-          <w:rFonts w:ascii="Times New Roman" w:hAnsi="Times New Roman" w:cs="Times New Roman"/>
-          <w:b w:val="0"/>
-          <w:i w:val="0"/>
-          <w:color w:val="000000"/>
+        <w:tabs>
+          <w:tab w:pos="567" w:val="left"/>
+        </w:tabs>
+        <w:spacing w:before="40" w:after="60" w:line="240" w:lineRule="auto" w:beforeAutospacing="0" w:afterAutospacing="0"/>
+        <w:ind w:left="567" w:hanging="567"/>
+        <w:jc w:val="left"/>
+      </w:pPr>
+      <w:r>
+        <w:rPr>
+          <w:rFonts w:ascii="Times New Roman" w:hAnsi="Times New Roman"/>
+          <w:b/>
+          <w:color w:val="C00000"/>
           <w:sz w:val="24"/>
+          <w:highlight w:val="yellow"/>
         </w:rPr>
         <w:t>[12]</w:t>
+      </w:r>
+      <w:r>
+        <w:rPr>
+          <w:rFonts w:ascii="Times New Roman" w:hAnsi="Times New Roman"/>
+          <w:sz w:val="24"/>
+        </w:rPr>
         <w:tab/>
       </w:r>
       <w:r>
         <w:rPr>
-          <w:rFonts w:ascii="Times New Roman" w:hAnsi="Times New Roman" w:cs="Times New Roman"/>
-          <w:b w:val="0"/>
-          <w:i w:val="0"/>
-          <w:color w:val="000000"/>
+          <w:rFonts w:ascii="Times New Roman" w:hAnsi="Times New Roman"/>
           <w:sz w:val="24"/>
         </w:rPr>
-        <w:t xml:space="preserve">J. Acharya et al., "Large Language Models for Financial Sentiment Analysis and Natural Language Interfaces: A Comprehensive Review," </w:t>
-      </w:r>
-      <w:r>
-        <w:rPr>
-          <w:rFonts w:ascii="Times New Roman" w:hAnsi="Times New Roman" w:cs="Times New Roman"/>
-          <w:b w:val="0"/>
+        <w:t xml:space="preserve">Z. Xi, W. Chen, X. Guo, et al., "The Rise and Potential of Large Language Model Based Agents: A Survey," </w:t>
+      </w:r>
+      <w:r>
+        <w:rPr>
+          <w:rFonts w:ascii="Times New Roman" w:hAnsi="Times New Roman"/>
           <w:i/>
-          <w:color w:val="000000"/>
           <w:sz w:val="24"/>
         </w:rPr>
-        <w:t>IEEE Access</w:t>
-      </w:r>
-      <w:r>
-        <w:rPr>
-          <w:rFonts w:ascii="Times New Roman" w:hAnsi="Times New Roman" w:cs="Times New Roman"/>
-          <w:b w:val="0"/>
-          <w:i w:val="0"/>
-          <w:color w:val="000000"/>
+        <w:t>arXiv:2309.07864</w:t>
+      </w:r>
+      <w:r>
+        <w:rPr>
+          <w:rFonts w:ascii="Times New Roman" w:hAnsi="Times New Roman"/>
           <w:sz w:val="24"/>
         </w:rPr>
-        <w:t>, vol. 12, pp. 21045–21060, 2024, doi: 10.1109/ACCESS.2024.3361280.</w:t>
+        <w:t>, 2023, doi: 10.48550/arXiv.2309.07864.</w:t>
       </w:r>
     </w:p>
     <w:p>
       <w:pPr>
-        <w:spacing w:before="30" w:after="60" w:line="240" w:lineRule="auto" w:beforeAutospacing="0" w:afterAutospacing="0"/>
-      </w:pPr>
-      <w:r>
-        <w:rPr>
-          <w:rFonts w:ascii="Times New Roman" w:hAnsi="Times New Roman" w:cs="Times New Roman"/>
-          <w:b w:val="0"/>
-          <w:i w:val="0"/>
-          <w:color w:val="000000"/>
+        <w:tabs>
+          <w:tab w:pos="567" w:val="left"/>
+        </w:tabs>
+        <w:spacing w:before="40" w:after="60" w:line="240" w:lineRule="auto" w:beforeAutospacing="0" w:afterAutospacing="0"/>
+        <w:ind w:left="567" w:hanging="567"/>
+        <w:jc w:val="left"/>
+      </w:pPr>
+      <w:r>
+        <w:rPr>
+          <w:rFonts w:ascii="Times New Roman" w:hAnsi="Times New Roman"/>
+          <w:b/>
+          <w:color w:val="C00000"/>
           <w:sz w:val="24"/>
+          <w:highlight w:val="yellow"/>
         </w:rPr>
         <w:t>[13]</w:t>
+      </w:r>
+      <w:r>
+        <w:rPr>
+          <w:rFonts w:ascii="Times New Roman" w:hAnsi="Times New Roman"/>
+          <w:sz w:val="24"/>
+        </w:rPr>
         <w:tab/>
       </w:r>
       <w:r>
         <w:rPr>
-          <w:rFonts w:ascii="Times New Roman" w:hAnsi="Times New Roman" w:cs="Times New Roman"/>
-          <w:b w:val="0"/>
-          <w:i w:val="0"/>
-          <w:color w:val="000000"/>
+          <w:rFonts w:ascii="Times New Roman" w:hAnsi="Times New Roman"/>
           <w:sz w:val="24"/>
         </w:rPr>
-        <w:t xml:space="preserve">K. Zhang, B. Debnath, and S. Chakradhar, "Agent-Based Frameworks for Automated Personal Wealth Management and Budget Guardrails," </w:t>
-      </w:r>
-      <w:r>
-        <w:rPr>
-          <w:rFonts w:ascii="Times New Roman" w:hAnsi="Times New Roman" w:cs="Times New Roman"/>
-          <w:b w:val="0"/>
+        <w:t xml:space="preserve">A. Singh, A. Ehtesham, S. Kumar, T. T. Khoei, and A. V. Vasilakos, "Agentic Retrieval-Augmented Generation: A Survey on Agentic RAG," </w:t>
+      </w:r>
+      <w:r>
+        <w:rPr>
+          <w:rFonts w:ascii="Times New Roman" w:hAnsi="Times New Roman"/>
           <w:i/>
-          <w:color w:val="000000"/>
           <w:sz w:val="24"/>
         </w:rPr>
-        <w:t>ACM Trans. Intell. Syst. Technol.</w:t>
-      </w:r>
-      <w:r>
-        <w:rPr>
-          <w:rFonts w:ascii="Times New Roman" w:hAnsi="Times New Roman" w:cs="Times New Roman"/>
-          <w:b w:val="0"/>
-          <w:i w:val="0"/>
-          <w:color w:val="000000"/>
+        <w:t>arXiv:2501.09136</w:t>
+      </w:r>
+      <w:r>
+        <w:rPr>
+          <w:rFonts w:ascii="Times New Roman" w:hAnsi="Times New Roman"/>
           <w:sz w:val="24"/>
         </w:rPr>
-        <w:t>, vol. 15, no. 3, pp. 1–24, 2024, doi: 10.1145/3643890.</w:t>
+        <w:t>, 2025, doi: 10.48550/arXiv.2501.09136.</w:t>
       </w:r>
     </w:p>
     <w:p>
       <w:pPr>
-        <w:spacing w:before="30" w:after="60" w:line="240" w:lineRule="auto" w:beforeAutospacing="0" w:afterAutospacing="0"/>
-      </w:pPr>
-      <w:r>
-        <w:rPr>
-          <w:rFonts w:ascii="Times New Roman" w:hAnsi="Times New Roman" w:cs="Times New Roman"/>
-          <w:b w:val="0"/>
-          <w:i w:val="0"/>
-          <w:color w:val="000000"/>
+        <w:tabs>
+          <w:tab w:pos="567" w:val="left"/>
+        </w:tabs>
+        <w:spacing w:before="40" w:after="60" w:line="240" w:lineRule="auto" w:beforeAutospacing="0" w:afterAutospacing="0"/>
+        <w:ind w:left="567" w:hanging="567"/>
+        <w:jc w:val="left"/>
+      </w:pPr>
+      <w:r>
+        <w:rPr>
+          <w:rFonts w:ascii="Times New Roman" w:hAnsi="Times New Roman"/>
+          <w:b/>
+          <w:color w:val="C00000"/>
           <w:sz w:val="24"/>
+          <w:highlight w:val="yellow"/>
         </w:rPr>
         <w:t>[14]</w:t>
+      </w:r>
+      <w:r>
+        <w:rPr>
+          <w:rFonts w:ascii="Times New Roman" w:hAnsi="Times New Roman"/>
+          <w:sz w:val="24"/>
+        </w:rPr>
         <w:tab/>
       </w:r>
       <w:r>
         <w:rPr>
-          <w:rFonts w:ascii="Times New Roman" w:hAnsi="Times New Roman" w:cs="Times New Roman"/>
-          <w:b w:val="0"/>
-          <w:i w:val="0"/>
-          <w:color w:val="000000"/>
+          <w:rFonts w:ascii="Times New Roman" w:hAnsi="Times New Roman"/>
           <w:sz w:val="24"/>
         </w:rPr>
-        <w:t xml:space="preserve">H. N. Pham and M. T. Vo, "Multi-Factor Asset Pricing and Portfolio Optimization Using Machine Learning on Emerging Markets," </w:t>
-      </w:r>
-      <w:r>
-        <w:rPr>
-          <w:rFonts w:ascii="Times New Roman" w:hAnsi="Times New Roman" w:cs="Times New Roman"/>
-          <w:b w:val="0"/>
+        <w:t xml:space="preserve">National Institute of Standards and Technology, "Artificial Intelligence Risk Management Framework: Generative Artificial Intelligence Profile," </w:t>
+      </w:r>
+      <w:r>
+        <w:rPr>
+          <w:rFonts w:ascii="Times New Roman" w:hAnsi="Times New Roman"/>
           <w:i/>
-          <w:color w:val="000000"/>
           <w:sz w:val="24"/>
         </w:rPr>
-        <w:t>J. Financ. Data Sci.</w:t>
-      </w:r>
-      <w:r>
-        <w:rPr>
-          <w:rFonts w:ascii="Times New Roman" w:hAnsi="Times New Roman" w:cs="Times New Roman"/>
-          <w:b w:val="0"/>
-          <w:i w:val="0"/>
-          <w:color w:val="000000"/>
+        <w:t>NIST AI 600-1</w:t>
+      </w:r>
+      <w:r>
+        <w:rPr>
+          <w:rFonts w:ascii="Times New Roman" w:hAnsi="Times New Roman"/>
           <w:sz w:val="24"/>
         </w:rPr>
-        <w:t>, vol. 5, no. 2, pp. 78–95, 2023, doi: 10.3905/jfds.2023.1.112.</w:t>
+        <w:t>, Gaithersburg, MD, USA, 2024.</w:t>
       </w:r>
     </w:p>
     <w:p>
       <w:pPr>
-        <w:spacing w:before="30" w:after="60" w:line="240" w:lineRule="auto" w:beforeAutospacing="0" w:afterAutospacing="0"/>
-      </w:pPr>
-      <w:r>
-        <w:rPr>
-          <w:rFonts w:ascii="Times New Roman" w:hAnsi="Times New Roman" w:cs="Times New Roman"/>
-          <w:b w:val="0"/>
-          <w:i w:val="0"/>
-          <w:color w:val="000000"/>
+        <w:tabs>
+          <w:tab w:pos="567" w:val="left"/>
+        </w:tabs>
+        <w:spacing w:before="40" w:after="60" w:line="240" w:lineRule="auto" w:beforeAutospacing="0" w:afterAutospacing="0"/>
+        <w:ind w:left="567" w:hanging="567"/>
+        <w:jc w:val="left"/>
+      </w:pPr>
+      <w:r>
+        <w:rPr>
+          <w:rFonts w:ascii="Times New Roman" w:hAnsi="Times New Roman"/>
+          <w:b/>
+          <w:color w:val="C00000"/>
           <w:sz w:val="24"/>
+          <w:highlight w:val="yellow"/>
         </w:rPr>
         <w:t>[15]</w:t>
+      </w:r>
+      <w:r>
+        <w:rPr>
+          <w:rFonts w:ascii="Times New Roman" w:hAnsi="Times New Roman"/>
+          <w:sz w:val="24"/>
+        </w:rPr>
         <w:tab/>
       </w:r>
       <w:r>
         <w:rPr>
-          <w:rFonts w:ascii="Times New Roman" w:hAnsi="Times New Roman" w:cs="Times New Roman"/>
-          <w:b w:val="0"/>
-          <w:i w:val="0"/>
-          <w:color w:val="000000"/>
+          <w:rFonts w:ascii="Times New Roman" w:hAnsi="Times New Roman"/>
           <w:sz w:val="24"/>
         </w:rPr>
+        <w:t xml:space="preserve">Y. Albadarin, M. Saqr, N. Pope, and M. Tukiainen, "A systematic literature review of empirical research on ChatGPT in education," </w:t>
+      </w:r>
+      <w:r>
+        <w:rPr>
+          <w:rFonts w:ascii="Times New Roman" w:hAnsi="Times New Roman"/>
+          <w:i/>
+          <w:sz w:val="24"/>
+        </w:rPr>
+        <w:t>Discov. Educ.</w:t>
+      </w:r>
+      <w:r>
+        <w:rPr>
+          <w:rFonts w:ascii="Times New Roman" w:hAnsi="Times New Roman"/>
+          <w:sz w:val="24"/>
+        </w:rPr>
+        <w:t>, vol. 3, no. 1, p. 60, 2024, doi: 10.1007/s44217-024-00138-2.</w:t>
+      </w:r>
+    </w:p>
+    <w:p>
+      <w:pPr>
+        <w:tabs>
+          <w:tab w:pos="567" w:val="left"/>
+        </w:tabs>
+        <w:spacing w:before="40" w:after="60" w:line="240" w:lineRule="auto" w:beforeAutospacing="0" w:afterAutospacing="0"/>
+        <w:ind w:left="567" w:hanging="567"/>
+        <w:jc w:val="left"/>
+      </w:pPr>
+      <w:r>
+        <w:rPr>
+          <w:rFonts w:ascii="Times New Roman" w:hAnsi="Times New Roman"/>
+          <w:b/>
+          <w:color w:val="C00000"/>
+          <w:sz w:val="24"/>
+          <w:highlight w:val="yellow"/>
+        </w:rPr>
+        <w:t>[16]</w:t>
+      </w:r>
+      <w:r>
+        <w:rPr>
+          <w:rFonts w:ascii="Times New Roman" w:hAnsi="Times New Roman"/>
+          <w:sz w:val="24"/>
+        </w:rPr>
+        <w:tab/>
+      </w:r>
+      <w:r>
+        <w:rPr>
+          <w:rFonts w:ascii="Times New Roman" w:hAnsi="Times New Roman"/>
+          <w:sz w:val="24"/>
+        </w:rPr>
+        <w:t xml:space="preserve">R. Guan, M. Raković, G. Chen, and D. Gašević, "How educational chatbots support self-regulated learning? A systematic review of the literature," </w:t>
+      </w:r>
+      <w:r>
+        <w:rPr>
+          <w:rFonts w:ascii="Times New Roman" w:hAnsi="Times New Roman"/>
+          <w:i/>
+          <w:sz w:val="24"/>
+        </w:rPr>
+        <w:t>Educ. Inf. Technol.</w:t>
+      </w:r>
+      <w:r>
+        <w:rPr>
+          <w:rFonts w:ascii="Times New Roman" w:hAnsi="Times New Roman"/>
+          <w:sz w:val="24"/>
+        </w:rPr>
+        <w:t>, vol. 30, no. 4, pp. 4493–4518, 2025.</w:t>
+      </w:r>
+    </w:p>
+    <w:p>
+      <w:pPr>
+        <w:tabs>
+          <w:tab w:pos="567" w:val="left"/>
+        </w:tabs>
+        <w:spacing w:before="40" w:after="60" w:line="240" w:lineRule="auto" w:beforeAutospacing="0" w:afterAutospacing="0"/>
+        <w:ind w:left="567" w:hanging="567"/>
+        <w:jc w:val="left"/>
+      </w:pPr>
+      <w:r>
+        <w:rPr>
+          <w:rFonts w:ascii="Times New Roman" w:hAnsi="Times New Roman"/>
+          <w:b/>
+          <w:color w:val="C00000"/>
+          <w:sz w:val="24"/>
+          <w:highlight w:val="yellow"/>
+        </w:rPr>
+        <w:t>[17]</w:t>
+      </w:r>
+      <w:r>
+        <w:rPr>
+          <w:rFonts w:ascii="Times New Roman" w:hAnsi="Times New Roman"/>
+          <w:sz w:val="24"/>
+        </w:rPr>
+        <w:tab/>
+      </w:r>
+      <w:r>
+        <w:rPr>
+          <w:rFonts w:ascii="Times New Roman" w:hAnsi="Times New Roman"/>
+          <w:sz w:val="24"/>
+        </w:rPr>
+        <w:t xml:space="preserve">C. McGrath, A. Farazouli, and T. Cerratto-Pargman, "Generative AI chatbots in higher education: a review of an emerging research area," </w:t>
+      </w:r>
+      <w:r>
+        <w:rPr>
+          <w:rFonts w:ascii="Times New Roman" w:hAnsi="Times New Roman"/>
+          <w:i/>
+          <w:sz w:val="24"/>
+        </w:rPr>
+        <w:t>High. Educ.</w:t>
+      </w:r>
+      <w:r>
+        <w:rPr>
+          <w:rFonts w:ascii="Times New Roman" w:hAnsi="Times New Roman"/>
+          <w:sz w:val="24"/>
+        </w:rPr>
+        <w:t>, vol. 89, no. 6, pp. 1533–1549, 2025, doi: 10.1007/s10734-024-01288-w.</w:t>
+      </w:r>
+    </w:p>
+    <w:p>
+      <w:pPr>
+        <w:tabs>
+          <w:tab w:pos="567" w:val="left"/>
+        </w:tabs>
+        <w:spacing w:before="40" w:after="60" w:line="240" w:lineRule="auto" w:beforeAutospacing="0" w:afterAutospacing="0"/>
+        <w:ind w:left="567" w:hanging="567"/>
+        <w:jc w:val="left"/>
+      </w:pPr>
+      <w:r>
+        <w:rPr>
+          <w:rFonts w:ascii="Times New Roman" w:hAnsi="Times New Roman"/>
+          <w:b/>
+          <w:color w:val="C00000"/>
+          <w:sz w:val="24"/>
+          <w:highlight w:val="yellow"/>
+        </w:rPr>
+        <w:t>[18]</w:t>
+      </w:r>
+      <w:r>
+        <w:rPr>
+          <w:rFonts w:ascii="Times New Roman" w:hAnsi="Times New Roman"/>
+          <w:sz w:val="24"/>
+        </w:rPr>
+        <w:tab/>
+      </w:r>
+      <w:r>
+        <w:rPr>
+          <w:rFonts w:ascii="Times New Roman" w:hAnsi="Times New Roman"/>
+          <w:sz w:val="24"/>
+        </w:rPr>
+        <w:t xml:space="preserve">E. Tabassi, "Artificial Intelligence Risk Management Framework (AI RMF 1.0)," </w:t>
+      </w:r>
+      <w:r>
+        <w:rPr>
+          <w:rFonts w:ascii="Times New Roman" w:hAnsi="Times New Roman"/>
+          <w:i/>
+          <w:sz w:val="24"/>
+        </w:rPr>
+        <w:t>NIST AI 100-1</w:t>
+      </w:r>
+      <w:r>
+        <w:rPr>
+          <w:rFonts w:ascii="Times New Roman" w:hAnsi="Times New Roman"/>
+          <w:sz w:val="24"/>
+        </w:rPr>
+        <w:t>, National Institute of Standards and Technology, Gaithersburg, MD, USA, 2023, doi: 10.6028/NIST.AI.100-1.</w:t>
+      </w:r>
+    </w:p>
+    <w:p>
+      <w:pPr>
+        <w:tabs>
+          <w:tab w:pos="567" w:val="left"/>
+        </w:tabs>
+        <w:spacing w:before="40" w:after="60" w:line="240" w:lineRule="auto" w:beforeAutospacing="0" w:afterAutospacing="0"/>
+        <w:ind w:left="567" w:hanging="567"/>
+        <w:jc w:val="left"/>
+      </w:pPr>
+      <w:r>
+        <w:rPr>
+          <w:rFonts w:ascii="Times New Roman" w:hAnsi="Times New Roman"/>
+          <w:b/>
+          <w:color w:val="C00000"/>
+          <w:sz w:val="24"/>
+          <w:highlight w:val="yellow"/>
+        </w:rPr>
+        <w:t>[19]</w:t>
+      </w:r>
+      <w:r>
+        <w:rPr>
+          <w:rFonts w:ascii="Times New Roman" w:hAnsi="Times New Roman"/>
+          <w:sz w:val="24"/>
+        </w:rPr>
+        <w:tab/>
+      </w:r>
+      <w:r>
+        <w:rPr>
+          <w:rFonts w:ascii="Times New Roman" w:hAnsi="Times New Roman"/>
+          <w:sz w:val="24"/>
+        </w:rPr>
         <w:t xml:space="preserve">E. F. Fama and K. R. French, "A five-factor asset pricing model," </w:t>
       </w:r>
       <w:r>
         <w:rPr>
-          <w:rFonts w:ascii="Times New Roman" w:hAnsi="Times New Roman" w:cs="Times New Roman"/>
-          <w:b w:val="0"/>
+          <w:rFonts w:ascii="Times New Roman" w:hAnsi="Times New Roman"/>
           <w:i/>
-          <w:color w:val="000000"/>
           <w:sz w:val="24"/>
         </w:rPr>
         <w:t>J. Financ. Econ.</w:t>
       </w:r>
       <w:r>
         <w:rPr>
-          <w:rFonts w:ascii="Times New Roman" w:hAnsi="Times New Roman" w:cs="Times New Roman"/>
-          <w:b w:val="0"/>
-          <w:i w:val="0"/>
-          <w:color w:val="000000"/>
+          <w:rFonts w:ascii="Times New Roman" w:hAnsi="Times New Roman"/>
           <w:sz w:val="24"/>
         </w:rPr>
-        <w:t>, vol. 116, no. 1, pp. 1–22, 2015 / Updated Factor Implementations 2023, doi: 10.1016/j.jfineco.2014.10.010.</w:t>
+        <w:t>, vol. 116, no. 1, pp. 1–22, 2015, doi: 10.1016/j.jfineco.2014.10.010.</w:t>
       </w:r>
     </w:p>
     <w:p>

</xml_diff>